<commit_message>
Update mc lamp manual, add css config
</commit_message>
<xml_diff>
--- a/static/mc_lamp/manual.docx
+++ b/static/mc_lamp/manual.docx
@@ -2,12 +2,6 @@
 <file path=word/document.xml><?xml version="1.0" encoding="utf-8"?>
 <w:document xmlns:wpc="http://schemas.microsoft.com/office/word/2010/wordprocessingCanvas" xmlns:cx="http://schemas.microsoft.com/office/drawing/2014/chartex" xmlns:cx1="http://schemas.microsoft.com/office/drawing/2015/9/8/chartex" xmlns:cx2="http://schemas.microsoft.com/office/drawing/2015/10/21/chartex" xmlns:cx3="http://schemas.microsoft.com/office/drawing/2016/5/9/chartex" xmlns:cx4="http://schemas.microsoft.com/office/drawing/2016/5/10/chartex" xmlns:cx5="http://schemas.microsoft.com/office/drawing/2016/5/11/chartex" xmlns:cx6="http://schemas.microsoft.com/office/drawing/2016/5/12/chartex" xmlns:cx7="http://schemas.microsoft.com/office/drawing/2016/5/13/chartex" xmlns:cx8="http://schemas.microsoft.com/office/drawing/2016/5/14/chartex" xmlns:mc="http://schemas.openxmlformats.org/markup-compatibility/2006" xmlns:aink="http://schemas.microsoft.com/office/drawing/2016/ink" xmlns:am3d="http://schemas.microsoft.com/office/drawing/2017/model3d" xmlns:o="urn:schemas-microsoft-com:office:office" xmlns:oel="http://schemas.microsoft.com/office/2019/extlst" xmlns:r="http://schemas.openxmlformats.org/officeDocument/2006/relationships" xmlns:m="http://schemas.openxmlformats.org/officeDocument/2006/math" xmlns:v="urn:schemas-microsoft-com:vml" xmlns:wp14="http://schemas.microsoft.com/office/word/2010/wordprocessingDrawing" xmlns:wp="http://schemas.openxmlformats.org/drawingml/2006/wordprocessingDrawing" xmlns:w10="urn:schemas-microsoft-com:office:word" xmlns:w="http://schemas.openxmlformats.org/wordprocessingml/2006/main" xmlns:w14="http://schemas.microsoft.com/office/word/2010/wordml" xmlns:w15="http://schemas.microsoft.com/office/word/2012/wordml" xmlns:w16cex="http://schemas.microsoft.com/office/word/2018/wordml/cex" xmlns:w16cid="http://schemas.microsoft.com/office/word/2016/wordml/cid" xmlns:w16="http://schemas.microsoft.com/office/word/2018/wordml" xmlns:w16sdtdh="http://schemas.microsoft.com/office/word/2020/wordml/sdtdatahash" xmlns:w16se="http://schemas.microsoft.com/office/word/2015/wordml/symex" xmlns:wpg="http://schemas.microsoft.com/office/word/2010/wordprocessingGroup" xmlns:wpi="http://schemas.microsoft.com/office/word/2010/wordprocessingInk" xmlns:wne="http://schemas.microsoft.com/office/word/2006/wordml" xmlns:wps="http://schemas.microsoft.com/office/word/2010/wordprocessingShape" mc:Ignorable="w14 w15 w16se w16cid w16 w16cex w16sdtdh wp14">
   <w:body>
-    <w:p/>
-    <w:p/>
-    <w:p/>
-    <w:p/>
-    <w:p/>
-    <w:p/>
     <w:p>
       <w:pPr>
         <w:jc w:val="center"/>
@@ -17,10 +11,10 @@
           <w:noProof/>
         </w:rPr>
         <w:drawing>
-          <wp:inline distT="0" distB="0" distL="0" distR="0" wp14:anchorId="4E5149D8" wp14:editId="331278BC">
-            <wp:extent cx="5036820" cy="1573771"/>
-            <wp:effectExtent l="0" t="0" r="0" b="0"/>
-            <wp:docPr id="9" name="Рисунок 9" descr="Установка прошивки WLED на ESP32 и ESP8266. Интеграция WLED в Home  Assistant - У Павла!"/>
+          <wp:inline distT="0" distB="0" distL="0" distR="0" wp14:anchorId="00199C32" wp14:editId="62C0B702">
+            <wp:extent cx="4207668" cy="4256797"/>
+            <wp:effectExtent l="0" t="0" r="2540" b="0"/>
+            <wp:docPr id="6" name="Рисунок 6"/>
             <wp:cNvGraphicFramePr>
               <a:graphicFrameLocks xmlns:a="http://schemas.openxmlformats.org/drawingml/2006/main" noChangeAspect="1"/>
             </wp:cNvGraphicFramePr>
@@ -28,28 +22,26 @@
               <a:graphicData uri="http://schemas.openxmlformats.org/drawingml/2006/picture">
                 <pic:pic xmlns:pic="http://schemas.openxmlformats.org/drawingml/2006/picture">
                   <pic:nvPicPr>
-                    <pic:cNvPr id="0" name="Picture 5" descr="Установка прошивки WLED на ESP32 и ESP8266. Интеграция WLED в Home  Assistant - У Павла!"/>
+                    <pic:cNvPr id="0" name="Picture 2"/>
                     <pic:cNvPicPr>
                       <a:picLocks noChangeAspect="1" noChangeArrowheads="1"/>
                     </pic:cNvPicPr>
                   </pic:nvPicPr>
-                  <pic:blipFill>
-                    <a:blip r:embed="rId5" cstate="print">
+                  <pic:blipFill rotWithShape="1">
+                    <a:blip r:embed="rId6" cstate="print">
                       <a:extLst>
                         <a:ext uri="{28A0092B-C50C-407E-A947-70E740481C1C}">
                           <a14:useLocalDpi xmlns:a14="http://schemas.microsoft.com/office/drawing/2010/main" val="0"/>
                         </a:ext>
                       </a:extLst>
                     </a:blip>
-                    <a:srcRect/>
-                    <a:stretch>
-                      <a:fillRect/>
-                    </a:stretch>
+                    <a:srcRect l="999" r="899"/>
+                    <a:stretch/>
                   </pic:blipFill>
                   <pic:spPr bwMode="auto">
                     <a:xfrm>
                       <a:off x="0" y="0"/>
-                      <a:ext cx="5052370" cy="1578630"/>
+                      <a:ext cx="4226432" cy="4275780"/>
                     </a:xfrm>
                     <a:prstGeom prst="rect">
                       <a:avLst/>
@@ -58,6 +50,11 @@
                     <a:ln>
                       <a:noFill/>
                     </a:ln>
+                    <a:extLst>
+                      <a:ext uri="{53640926-AAD7-44D8-BBD7-CCE9431645EC}">
+                        <a14:shadowObscured xmlns:a14="http://schemas.microsoft.com/office/drawing/2010/main"/>
+                      </a:ext>
+                    </a:extLst>
                   </pic:spPr>
                 </pic:pic>
               </a:graphicData>
@@ -65,59 +62,192 @@
           </wp:inline>
         </w:drawing>
       </w:r>
+      <w:r>
+        <w:rPr>
+          <w:noProof/>
+        </w:rPr>
+        <w:drawing>
+          <wp:inline distT="0" distB="0" distL="0" distR="0" wp14:anchorId="3F126C71" wp14:editId="16AF6BA1">
+            <wp:extent cx="4214812" cy="4259442"/>
+            <wp:effectExtent l="0" t="0" r="0" b="8255"/>
+            <wp:docPr id="5" name="Рисунок 5"/>
+            <wp:cNvGraphicFramePr>
+              <a:graphicFrameLocks xmlns:a="http://schemas.openxmlformats.org/drawingml/2006/main" noChangeAspect="1"/>
+            </wp:cNvGraphicFramePr>
+            <a:graphic xmlns:a="http://schemas.openxmlformats.org/drawingml/2006/main">
+              <a:graphicData uri="http://schemas.openxmlformats.org/drawingml/2006/picture">
+                <pic:pic xmlns:pic="http://schemas.openxmlformats.org/drawingml/2006/picture">
+                  <pic:nvPicPr>
+                    <pic:cNvPr id="0" name="Picture 1"/>
+                    <pic:cNvPicPr>
+                      <a:picLocks noChangeAspect="1" noChangeArrowheads="1"/>
+                    </pic:cNvPicPr>
+                  </pic:nvPicPr>
+                  <pic:blipFill rotWithShape="1">
+                    <a:blip r:embed="rId7" cstate="print">
+                      <a:extLst>
+                        <a:ext uri="{28A0092B-C50C-407E-A947-70E740481C1C}">
+                          <a14:useLocalDpi xmlns:a14="http://schemas.microsoft.com/office/drawing/2010/main" val="0"/>
+                        </a:ext>
+                      </a:extLst>
+                    </a:blip>
+                    <a:srcRect r="662"/>
+                    <a:stretch/>
+                  </pic:blipFill>
+                  <pic:spPr bwMode="auto">
+                    <a:xfrm>
+                      <a:off x="0" y="0"/>
+                      <a:ext cx="4233156" cy="4277980"/>
+                    </a:xfrm>
+                    <a:prstGeom prst="rect">
+                      <a:avLst/>
+                    </a:prstGeom>
+                    <a:noFill/>
+                    <a:ln>
+                      <a:noFill/>
+                    </a:ln>
+                    <a:extLst>
+                      <a:ext uri="{53640926-AAD7-44D8-BBD7-CCE9431645EC}">
+                        <a14:shadowObscured xmlns:a14="http://schemas.microsoft.com/office/drawing/2010/main"/>
+                      </a:ext>
+                    </a:extLst>
+                  </pic:spPr>
+                </pic:pic>
+              </a:graphicData>
+            </a:graphic>
+          </wp:inline>
+        </w:drawing>
+      </w:r>
     </w:p>
     <w:p/>
     <w:p/>
     <w:p>
       <w:pPr>
-        <w:jc w:val="center"/>
         <w:rPr>
           <w:b/>
           <w:bCs/>
-          <w:sz w:val="32"/>
-          <w:szCs w:val="32"/>
+          <w:sz w:val="44"/>
+          <w:szCs w:val="44"/>
         </w:rPr>
       </w:pPr>
       <w:r>
         <w:rPr>
           <w:b/>
           <w:bCs/>
-          <w:sz w:val="32"/>
-          <w:szCs w:val="32"/>
-        </w:rPr>
-        <w:t xml:space="preserve">Светильник на базе </w:t>
-      </w:r>
-      <w:r>
+          <w:sz w:val="44"/>
+          <w:szCs w:val="44"/>
+        </w:rPr>
+        <w:lastRenderedPageBreak/>
+        <w:t>Я умею…</w:t>
+      </w:r>
+    </w:p>
+    <w:p>
+      <w:pPr>
+        <w:rPr>
+          <w:sz w:val="44"/>
+          <w:szCs w:val="44"/>
+        </w:rPr>
+      </w:pPr>
+      <w:r>
+        <w:rPr>
+          <w:sz w:val="44"/>
+          <w:szCs w:val="44"/>
+        </w:rPr>
+        <w:t>…</w:t>
+      </w:r>
+      <w:r>
+        <w:rPr>
+          <w:sz w:val="44"/>
+          <w:szCs w:val="44"/>
+        </w:rPr>
+        <w:t xml:space="preserve"> подключаться к </w:t>
+      </w:r>
+      <w:r>
+        <w:rPr>
+          <w:sz w:val="44"/>
+          <w:szCs w:val="44"/>
+          <w:lang w:val="en-US"/>
+        </w:rPr>
+        <w:t>Wi-Fi</w:t>
+      </w:r>
+    </w:p>
+    <w:p>
+      <w:pPr>
+        <w:rPr>
+          <w:sz w:val="44"/>
+          <w:szCs w:val="44"/>
+        </w:rPr>
+      </w:pPr>
+      <w:r>
+        <w:rPr>
+          <w:sz w:val="44"/>
+          <w:szCs w:val="44"/>
+        </w:rPr>
+        <w:t>… работать от аккумулятора</w:t>
+      </w:r>
+    </w:p>
+    <w:p>
+      <w:pPr>
+        <w:rPr>
+          <w:sz w:val="44"/>
+          <w:szCs w:val="44"/>
+        </w:rPr>
+      </w:pPr>
+      <w:r>
+        <w:rPr>
+          <w:sz w:val="44"/>
+          <w:szCs w:val="44"/>
+        </w:rPr>
+        <w:t>… подключаться к некоторым умным домам</w:t>
+      </w:r>
+    </w:p>
+    <w:p>
+      <w:pPr>
+        <w:rPr>
+          <w:sz w:val="44"/>
+          <w:szCs w:val="44"/>
+        </w:rPr>
+      </w:pPr>
+      <w:r>
+        <w:rPr>
+          <w:sz w:val="44"/>
+          <w:szCs w:val="44"/>
+        </w:rPr>
+        <w:t xml:space="preserve">… работать синхронно с другими </w:t>
+      </w:r>
+      <w:proofErr w:type="spellStart"/>
+      <w:r>
+        <w:rPr>
+          <w:sz w:val="44"/>
+          <w:szCs w:val="44"/>
+          <w:lang w:val="en-US"/>
+        </w:rPr>
+        <w:t>wled</w:t>
+      </w:r>
+      <w:proofErr w:type="spellEnd"/>
+      <w:r>
+        <w:rPr>
+          <w:sz w:val="44"/>
+          <w:szCs w:val="44"/>
+        </w:rPr>
+        <w:t xml:space="preserve"> </w:t>
+      </w:r>
+      <w:r>
+        <w:rPr>
+          <w:sz w:val="44"/>
+          <w:szCs w:val="44"/>
+        </w:rPr>
+        <w:t>устройствами</w:t>
+      </w:r>
+    </w:p>
+    <w:p>
+      <w:pPr>
+        <w:jc w:val="center"/>
         <w:rPr>
           <w:b/>
           <w:bCs/>
-          <w:sz w:val="32"/>
-          <w:szCs w:val="32"/>
-          <w:lang w:val="en-US"/>
-        </w:rPr>
-        <w:t>WLED</w:t>
-      </w:r>
-    </w:p>
-    <w:p>
-      <w:pPr>
-        <w:jc w:val="center"/>
-        <w:rPr>
-          <w:sz w:val="28"/>
-          <w:szCs w:val="28"/>
-        </w:rPr>
-      </w:pPr>
-      <w:r>
-        <w:rPr>
-          <w:sz w:val="28"/>
-          <w:szCs w:val="28"/>
-        </w:rPr>
-        <w:t>Руководство пользователя</w:t>
-      </w:r>
-    </w:p>
-    <w:p>
-      <w:r>
-        <w:br w:type="page"/>
-      </w:r>
+        </w:rPr>
+      </w:pPr>
     </w:p>
     <w:p>
       <w:pPr>
@@ -125,137 +255,243 @@
         <w:rPr>
           <w:b/>
           <w:bCs/>
+          <w:sz w:val="48"/>
+          <w:szCs w:val="48"/>
         </w:rPr>
       </w:pPr>
       <w:r>
         <w:rPr>
           <w:b/>
           <w:bCs/>
-        </w:rPr>
-        <w:lastRenderedPageBreak/>
+          <w:sz w:val="48"/>
+          <w:szCs w:val="48"/>
+        </w:rPr>
         <w:t>Первое включение и настройка</w:t>
       </w:r>
     </w:p>
     <w:p>
-      <w:r>
-        <w:t>1. Подключите светильн</w:t>
-      </w:r>
-      <w:r>
-        <w:t>ик</w:t>
-      </w:r>
-      <w:r>
-        <w:t xml:space="preserve"> через </w:t>
+      <w:pPr>
+        <w:pStyle w:val="a7"/>
+        <w:numPr>
+          <w:ilvl w:val="0"/>
+          <w:numId w:val="1"/>
+        </w:numPr>
+        <w:ind w:left="426"/>
+        <w:rPr>
+          <w:sz w:val="28"/>
+          <w:szCs w:val="28"/>
+        </w:rPr>
+      </w:pPr>
+      <w:r>
+        <w:rPr>
+          <w:sz w:val="28"/>
+          <w:szCs w:val="28"/>
+        </w:rPr>
+        <w:t>Включи выключатель снизу</w:t>
+      </w:r>
+    </w:p>
+    <w:p>
+      <w:pPr>
+        <w:pStyle w:val="a7"/>
+        <w:numPr>
+          <w:ilvl w:val="0"/>
+          <w:numId w:val="1"/>
+        </w:numPr>
+        <w:ind w:left="426"/>
+        <w:rPr>
+          <w:sz w:val="28"/>
+          <w:szCs w:val="28"/>
+        </w:rPr>
+      </w:pPr>
+      <w:r>
+        <w:rPr>
+          <w:sz w:val="28"/>
+          <w:szCs w:val="28"/>
+        </w:rPr>
+        <w:t xml:space="preserve">Подключи </w:t>
+      </w:r>
+      <w:r>
+        <w:rPr>
+          <w:sz w:val="28"/>
+          <w:szCs w:val="28"/>
+          <w:lang w:val="en-US"/>
+        </w:rPr>
+        <w:t>USB</w:t>
+      </w:r>
+      <w:r>
+        <w:rPr>
+          <w:sz w:val="28"/>
+          <w:szCs w:val="28"/>
+        </w:rPr>
+        <w:t>-</w:t>
+      </w:r>
+      <w:r>
+        <w:rPr>
+          <w:sz w:val="28"/>
+          <w:szCs w:val="28"/>
+          <w:lang w:val="en-US"/>
+        </w:rPr>
+        <w:t>C</w:t>
+      </w:r>
+      <w:r>
+        <w:rPr>
+          <w:sz w:val="28"/>
+          <w:szCs w:val="28"/>
+        </w:rPr>
+        <w:t xml:space="preserve"> зарядку в разъем зарядки</w:t>
+      </w:r>
+      <w:r>
+        <w:rPr>
+          <w:sz w:val="28"/>
+          <w:szCs w:val="28"/>
+        </w:rPr>
+        <w:t>.</w:t>
+      </w:r>
+    </w:p>
+    <w:p>
+      <w:pPr>
+        <w:pStyle w:val="a7"/>
+        <w:numPr>
+          <w:ilvl w:val="0"/>
+          <w:numId w:val="1"/>
+        </w:numPr>
+        <w:ind w:left="426"/>
+        <w:rPr>
+          <w:sz w:val="28"/>
+          <w:szCs w:val="28"/>
+        </w:rPr>
+      </w:pPr>
+      <w:r>
+        <w:rPr>
+          <w:sz w:val="28"/>
+          <w:szCs w:val="28"/>
+        </w:rPr>
+        <w:t>Короткое нажатие на кнопку</w:t>
+      </w:r>
+      <w:r>
+        <w:rPr>
+          <w:sz w:val="28"/>
+          <w:szCs w:val="28"/>
+        </w:rPr>
+        <w:t xml:space="preserve"> сверху</w:t>
+      </w:r>
+      <w:r>
+        <w:rPr>
+          <w:sz w:val="28"/>
+          <w:szCs w:val="28"/>
+        </w:rPr>
+        <w:t xml:space="preserve"> включает и отключает светильник. Длительное – переключает цвета.</w:t>
+      </w:r>
+    </w:p>
+    <w:p>
+      <w:pPr>
+        <w:pStyle w:val="a7"/>
+        <w:numPr>
+          <w:ilvl w:val="0"/>
+          <w:numId w:val="1"/>
+        </w:numPr>
+        <w:ind w:left="426"/>
+        <w:rPr>
+          <w:sz w:val="28"/>
+          <w:szCs w:val="28"/>
+        </w:rPr>
+      </w:pPr>
+      <w:r>
+        <w:rPr>
+          <w:sz w:val="28"/>
+          <w:szCs w:val="28"/>
+        </w:rPr>
+        <w:t>При первом включении я создам</w:t>
+      </w:r>
+      <w:r>
+        <w:rPr>
+          <w:sz w:val="28"/>
+          <w:szCs w:val="28"/>
+        </w:rPr>
+        <w:t xml:space="preserve"> </w:t>
       </w:r>
       <w:proofErr w:type="spellStart"/>
       <w:r>
         <w:rPr>
-          <w:lang w:val="en-US"/>
-        </w:rPr>
-        <w:t>usb</w:t>
+          <w:sz w:val="28"/>
+          <w:szCs w:val="28"/>
+          <w:lang w:val="en-US"/>
+        </w:rPr>
+        <w:t>W</w:t>
+      </w:r>
+      <w:r>
+        <w:rPr>
+          <w:sz w:val="28"/>
+          <w:szCs w:val="28"/>
+          <w:lang w:val="en-US"/>
+        </w:rPr>
+        <w:t>i</w:t>
+      </w:r>
+      <w:r>
+        <w:rPr>
+          <w:sz w:val="28"/>
+          <w:szCs w:val="28"/>
+          <w:lang w:val="en-US"/>
+        </w:rPr>
+        <w:t>F</w:t>
+      </w:r>
+      <w:r>
+        <w:rPr>
+          <w:sz w:val="28"/>
+          <w:szCs w:val="28"/>
+          <w:lang w:val="en-US"/>
+        </w:rPr>
+        <w:t>i</w:t>
       </w:r>
       <w:proofErr w:type="spellEnd"/>
       <w:r>
-        <w:t>-</w:t>
-      </w:r>
-      <w:r>
-        <w:rPr>
-          <w:lang w:val="en-US"/>
-        </w:rPr>
-        <w:t>c</w:t>
-      </w:r>
-      <w:r>
-        <w:t xml:space="preserve"> </w:t>
-      </w:r>
-      <w:r>
-        <w:t xml:space="preserve">разъем зарядным устройством на 1А и выше. </w:t>
-      </w:r>
-    </w:p>
-    <w:p>
-      <w:pPr>
+        <w:rPr>
+          <w:sz w:val="28"/>
+          <w:szCs w:val="28"/>
+        </w:rPr>
+        <w:t xml:space="preserve"> точку доступа </w:t>
+      </w:r>
+      <w:r>
         <w:rPr>
           <w:i/>
           <w:iCs/>
-        </w:rPr>
-      </w:pPr>
-      <w:r>
-        <w:rPr>
-          <w:i/>
-          <w:iCs/>
-        </w:rPr>
-        <w:t xml:space="preserve">Не рекомендуется подключать устройство к </w:t>
-      </w:r>
-      <w:r>
-        <w:rPr>
-          <w:i/>
-          <w:iCs/>
-          <w:lang w:val="en-US"/>
-        </w:rPr>
-        <w:t>USB</w:t>
-      </w:r>
-      <w:r>
-        <w:rPr>
-          <w:i/>
-          <w:iCs/>
-        </w:rPr>
-        <w:t xml:space="preserve"> 2.0 разъемам компьютера т.к. рассчитаны только на 0.25А.</w:t>
-      </w:r>
-    </w:p>
-    <w:p>
-      <w:r>
-        <w:t xml:space="preserve">2. Светильник загрузится и начнет гореть желтым светом. </w:t>
-      </w:r>
-      <w:r>
-        <w:t>Короткое н</w:t>
-      </w:r>
-      <w:r>
-        <w:t>ажатие на кнопку</w:t>
-      </w:r>
-      <w:r>
-        <w:t xml:space="preserve"> </w:t>
-      </w:r>
-      <w:r>
-        <w:t>включает и отключает светильник.</w:t>
-      </w:r>
-      <w:r>
-        <w:t xml:space="preserve"> Длительное – переключает цвета.</w:t>
-      </w:r>
-      <w:r>
-        <w:t xml:space="preserve"> </w:t>
-      </w:r>
-    </w:p>
-    <w:p>
-      <w:r>
-        <w:t xml:space="preserve">3. </w:t>
-      </w:r>
-      <w:r>
-        <w:t xml:space="preserve">Светильник создаст </w:t>
-      </w:r>
-      <w:r>
-        <w:rPr>
-          <w:lang w:val="en-US"/>
-        </w:rPr>
-        <w:t>WIFI</w:t>
-      </w:r>
-      <w:r>
-        <w:t xml:space="preserve"> </w:t>
-      </w:r>
-      <w:r>
-        <w:t xml:space="preserve">точку доступа </w:t>
-      </w:r>
-      <w:r>
-        <w:t xml:space="preserve">WLED-AP, необходимо к ней подключиться с паролем </w:t>
-      </w:r>
-      <w:r>
-        <w:rPr>
+          <w:sz w:val="28"/>
+          <w:szCs w:val="28"/>
+        </w:rPr>
+        <w:t>WLED-AP</w:t>
+      </w:r>
+      <w:r>
+        <w:rPr>
+          <w:sz w:val="28"/>
+          <w:szCs w:val="28"/>
+        </w:rPr>
+        <w:t xml:space="preserve">, необходимо к ней подключиться с паролем </w:t>
+      </w:r>
+      <w:r>
+        <w:rPr>
+          <w:sz w:val="28"/>
+          <w:szCs w:val="28"/>
           <w:u w:val="single"/>
         </w:rPr>
         <w:t>wled1234</w:t>
       </w:r>
       <w:r>
+        <w:rPr>
+          <w:sz w:val="28"/>
+          <w:szCs w:val="28"/>
+        </w:rPr>
         <w:t xml:space="preserve"> или отсканировав QR код:</w:t>
       </w:r>
     </w:p>
     <w:p>
+      <w:pPr>
+        <w:pStyle w:val="a7"/>
+        <w:ind w:left="426"/>
+        <w:rPr>
+          <w:sz w:val="28"/>
+          <w:szCs w:val="28"/>
+        </w:rPr>
+      </w:pPr>
       <w:r>
         <w:rPr>
           <w:noProof/>
@@ -278,7 +514,7 @@
                     </pic:cNvPicPr>
                   </pic:nvPicPr>
                   <pic:blipFill rotWithShape="1">
-                    <a:blip r:embed="rId6">
+                    <a:blip r:embed="rId8">
                       <a:extLst>
                         <a:ext uri="{28A0092B-C50C-407E-A947-70E740481C1C}">
                           <a14:useLocalDpi xmlns:a14="http://schemas.microsoft.com/office/drawing/2010/main" val="0"/>
@@ -314,178 +550,174 @@
       </w:r>
     </w:p>
     <w:p>
-      <w:r>
-        <w:t xml:space="preserve">Перейдите по адресу </w:t>
-      </w:r>
-      <w:r>
-        <w:rPr>
-          <w:u w:val="single"/>
-        </w:rPr>
-        <w:t>4.3.2.1</w:t>
-      </w:r>
-      <w:r>
+      <w:pPr>
+        <w:pStyle w:val="a7"/>
+        <w:numPr>
+          <w:ilvl w:val="0"/>
+          <w:numId w:val="1"/>
+        </w:numPr>
+        <w:ind w:left="426"/>
+        <w:rPr>
+          <w:sz w:val="28"/>
+          <w:szCs w:val="28"/>
+        </w:rPr>
+      </w:pPr>
+      <w:r>
+        <w:rPr>
+          <w:sz w:val="28"/>
+          <w:szCs w:val="28"/>
+        </w:rPr>
+        <w:t xml:space="preserve">Открой любой браузер с устройства, которым подключился и перейди по адресу 4.3.2.1 или </w:t>
+      </w:r>
+      <w:proofErr w:type="spellStart"/>
+      <w:r>
+        <w:rPr>
+          <w:sz w:val="28"/>
+          <w:szCs w:val="28"/>
+          <w:lang w:val="en-US"/>
+        </w:rPr>
+        <w:t>wled</w:t>
+      </w:r>
+      <w:proofErr w:type="spellEnd"/>
+      <w:r>
+        <w:rPr>
+          <w:sz w:val="28"/>
+          <w:szCs w:val="28"/>
+        </w:rPr>
+        <w:t>.</w:t>
+      </w:r>
+      <w:r>
+        <w:rPr>
+          <w:sz w:val="28"/>
+          <w:szCs w:val="28"/>
+          <w:lang w:val="en-US"/>
+        </w:rPr>
+        <w:t>me</w:t>
+      </w:r>
+      <w:r>
+        <w:rPr>
+          <w:sz w:val="28"/>
+          <w:szCs w:val="28"/>
+        </w:rPr>
+        <w:t>. Не спутай с поиском.</w:t>
+      </w:r>
+    </w:p>
+    <w:p>
+      <w:pPr>
+        <w:pStyle w:val="a7"/>
+        <w:numPr>
+          <w:ilvl w:val="0"/>
+          <w:numId w:val="1"/>
+        </w:numPr>
+        <w:ind w:left="426"/>
+        <w:rPr>
+          <w:sz w:val="28"/>
+          <w:szCs w:val="28"/>
+        </w:rPr>
+      </w:pPr>
+      <w:r>
+        <w:rPr>
+          <w:sz w:val="28"/>
+          <w:szCs w:val="28"/>
+        </w:rPr>
+        <w:t xml:space="preserve">Для того чтобы перейти в настройки </w:t>
+      </w:r>
+      <w:proofErr w:type="spellStart"/>
+      <w:r>
+        <w:rPr>
+          <w:sz w:val="28"/>
+          <w:szCs w:val="28"/>
+          <w:lang w:val="en-US"/>
+        </w:rPr>
+        <w:t>WiFi</w:t>
+      </w:r>
+      <w:proofErr w:type="spellEnd"/>
+      <w:r>
+        <w:rPr>
+          <w:sz w:val="28"/>
+          <w:szCs w:val="28"/>
+        </w:rPr>
         <w:t xml:space="preserve"> </w:t>
       </w:r>
       <w:r>
-        <w:t xml:space="preserve">или </w:t>
-      </w:r>
-      <w:r>
-        <w:rPr>
-          <w:u w:val="single"/>
-        </w:rPr>
-        <w:t xml:space="preserve">wled.me </w:t>
-      </w:r>
-      <w:r>
-        <w:t>в браузере. Откроется стартовая страница</w:t>
-      </w:r>
-      <w:r>
-        <w:t xml:space="preserve"> с кнопками </w:t>
-      </w:r>
-      <w:r>
-        <w:rPr>
-          <w:lang w:val="en-US"/>
-        </w:rPr>
-        <w:t>Setup</w:t>
-      </w:r>
-      <w:r>
+        <w:rPr>
+          <w:sz w:val="28"/>
+          <w:szCs w:val="28"/>
+        </w:rPr>
+        <w:t xml:space="preserve">нажми </w:t>
+      </w:r>
+      <w:r>
+        <w:rPr>
+          <w:sz w:val="28"/>
+          <w:szCs w:val="28"/>
+          <w:lang w:val="en-US"/>
+        </w:rPr>
+        <w:t>Go</w:t>
+      </w:r>
+      <w:r>
+        <w:rPr>
+          <w:sz w:val="28"/>
+          <w:szCs w:val="28"/>
+        </w:rPr>
         <w:t xml:space="preserve"> </w:t>
       </w:r>
       <w:r>
         <w:rPr>
-          <w:lang w:val="en-US"/>
-        </w:rPr>
-        <w:t>WIFI</w:t>
-      </w:r>
-      <w:r>
+          <w:sz w:val="28"/>
+          <w:szCs w:val="28"/>
+          <w:lang w:val="en-US"/>
+        </w:rPr>
+        <w:t>to</w:t>
+      </w:r>
+      <w:r>
+        <w:rPr>
+          <w:sz w:val="28"/>
+          <w:szCs w:val="28"/>
+        </w:rPr>
         <w:t xml:space="preserve"> </w:t>
       </w:r>
       <w:r>
-        <w:t xml:space="preserve">и </w:t>
-      </w:r>
-      <w:r>
-        <w:rPr>
-          <w:lang w:val="en-US"/>
-        </w:rPr>
-        <w:t>Go</w:t>
-      </w:r>
-      <w:r>
-        <w:t xml:space="preserve"> </w:t>
-      </w:r>
-      <w:r>
-        <w:rPr>
-          <w:lang w:val="en-US"/>
-        </w:rPr>
-        <w:t>Controls</w:t>
-      </w:r>
-      <w:r>
-        <w:t>.</w:t>
-      </w:r>
-      <w:r>
-        <w:t xml:space="preserve"> Рекомендуется подключить светильник к вашему </w:t>
-      </w:r>
-      <w:proofErr w:type="spellStart"/>
-      <w:r>
-        <w:rPr>
-          <w:lang w:val="en-US"/>
-        </w:rPr>
-        <w:t>wifi</w:t>
-      </w:r>
-      <w:proofErr w:type="spellEnd"/>
-      <w:r>
-        <w:t xml:space="preserve">, нажав </w:t>
-      </w:r>
-      <w:r>
-        <w:rPr>
-          <w:lang w:val="en-US"/>
-        </w:rPr>
-        <w:t>Setup</w:t>
-      </w:r>
-      <w:r>
-        <w:t xml:space="preserve"> </w:t>
-      </w:r>
-      <w:r>
-        <w:rPr>
-          <w:lang w:val="en-US"/>
-        </w:rPr>
-        <w:t>WIFI</w:t>
-      </w:r>
-      <w:r>
-        <w:t>.</w:t>
-      </w:r>
-      <w:r>
-        <w:t xml:space="preserve"> </w:t>
-      </w:r>
-      <w:r>
-        <w:t xml:space="preserve">Отобразить список </w:t>
-      </w:r>
-      <w:proofErr w:type="spellStart"/>
-      <w:r>
-        <w:rPr>
-          <w:lang w:val="en-US"/>
-        </w:rPr>
-        <w:t>WiFi</w:t>
-      </w:r>
-      <w:proofErr w:type="spellEnd"/>
-      <w:r>
-        <w:t xml:space="preserve"> </w:t>
-      </w:r>
-      <w:r>
-        <w:t xml:space="preserve">можно нажав кнопку </w:t>
-      </w:r>
-      <w:r>
-        <w:rPr>
-          <w:lang w:val="en-US"/>
-        </w:rPr>
-        <w:t>Scan</w:t>
-      </w:r>
-    </w:p>
-    <w:p>
-      <w:pPr>
-        <w:rPr>
-          <w:i/>
-          <w:iCs/>
-        </w:rPr>
-      </w:pPr>
-      <w:r>
-        <w:rPr>
-          <w:i/>
-          <w:iCs/>
-        </w:rPr>
-        <w:t xml:space="preserve">Обратите внимание, поддерживается только 2.4ГГц </w:t>
-      </w:r>
-      <w:proofErr w:type="spellStart"/>
-      <w:r>
-        <w:rPr>
-          <w:i/>
-          <w:iCs/>
-          <w:lang w:val="en-US"/>
-        </w:rPr>
-        <w:t>WiFi</w:t>
-      </w:r>
-      <w:proofErr w:type="spellEnd"/>
-      <w:r>
-        <w:rPr>
-          <w:i/>
-          <w:iCs/>
-        </w:rPr>
-        <w:t>.</w:t>
-      </w:r>
-    </w:p>
-    <w:p>
-      <w:pPr>
-        <w:rPr>
-          <w:lang w:val="en-US"/>
+        <w:rPr>
+          <w:sz w:val="28"/>
+          <w:szCs w:val="28"/>
+          <w:lang w:val="en-US"/>
+        </w:rPr>
+        <w:t>settings</w:t>
+      </w:r>
+      <w:r>
+        <w:rPr>
+          <w:sz w:val="28"/>
+          <w:szCs w:val="28"/>
+        </w:rPr>
+        <w:t xml:space="preserve">. </w:t>
+      </w:r>
+      <w:r>
+        <w:rPr>
+          <w:sz w:val="28"/>
+          <w:szCs w:val="28"/>
+        </w:rPr>
+        <w:t>Нажми.</w:t>
+      </w:r>
+    </w:p>
+    <w:p>
+      <w:pPr>
+        <w:pStyle w:val="a7"/>
+        <w:ind w:left="426"/>
+        <w:rPr>
+          <w:sz w:val="28"/>
+          <w:szCs w:val="28"/>
         </w:rPr>
       </w:pPr>
       <w:r>
         <w:rPr>
           <w:noProof/>
         </w:rPr>
+        <w:lastRenderedPageBreak/>
         <w:drawing>
-          <wp:inline distT="0" distB="0" distL="0" distR="0" wp14:anchorId="140F0ABC" wp14:editId="46985999">
-            <wp:extent cx="2684987" cy="1783080"/>
-            <wp:effectExtent l="0" t="0" r="1270" b="7620"/>
-            <wp:docPr id="2" name="Рисунок 2"/>
+          <wp:inline distT="0" distB="0" distL="0" distR="0" wp14:anchorId="1DB6526F" wp14:editId="61742276">
+            <wp:extent cx="3264694" cy="4360952"/>
+            <wp:effectExtent l="0" t="0" r="0" b="1905"/>
+            <wp:docPr id="10" name="Рисунок 10"/>
             <wp:cNvGraphicFramePr>
               <a:graphicFrameLocks xmlns:a="http://schemas.openxmlformats.org/drawingml/2006/main" noChangeAspect="1"/>
             </wp:cNvGraphicFramePr>
@@ -499,20 +731,20 @@
                     </pic:cNvPicPr>
                   </pic:nvPicPr>
                   <pic:blipFill rotWithShape="1">
-                    <a:blip r:embed="rId7">
+                    <a:blip r:embed="rId9" cstate="print">
                       <a:extLst>
                         <a:ext uri="{28A0092B-C50C-407E-A947-70E740481C1C}">
                           <a14:useLocalDpi xmlns:a14="http://schemas.microsoft.com/office/drawing/2010/main" val="0"/>
                         </a:ext>
                       </a:extLst>
                     </a:blip>
-                    <a:srcRect l="34249" r="32528" b="50492"/>
+                    <a:srcRect t="5911" b="32433"/>
                     <a:stretch/>
                   </pic:blipFill>
                   <pic:spPr bwMode="auto">
                     <a:xfrm>
                       <a:off x="0" y="0"/>
-                      <a:ext cx="2691399" cy="1787338"/>
+                      <a:ext cx="3285468" cy="4388702"/>
                     </a:xfrm>
                     <a:prstGeom prst="rect">
                       <a:avLst/>
@@ -535,389 +767,130 @@
       </w:r>
     </w:p>
     <w:p>
-      <w:r>
-        <w:t xml:space="preserve">Если вы </w:t>
-      </w:r>
-      <w:r>
-        <w:rPr>
-          <w:u w:val="single"/>
-        </w:rPr>
-        <w:t>не</w:t>
-      </w:r>
-      <w:r>
-        <w:t xml:space="preserve"> планируете подключать светильник к </w:t>
-      </w:r>
-      <w:proofErr w:type="spellStart"/>
-      <w:r>
-        <w:rPr>
-          <w:lang w:val="en-US"/>
-        </w:rPr>
-        <w:t>WiFi</w:t>
-      </w:r>
-      <w:proofErr w:type="spellEnd"/>
-      <w:r>
-        <w:t>, то рекомендуется изменить стандартный пароль.</w:t>
-      </w:r>
-    </w:p>
-    <w:p>
-      <w:r>
-        <w:t xml:space="preserve">4. </w:t>
-      </w:r>
-      <w:r>
-        <w:t xml:space="preserve">После подключения к </w:t>
-      </w:r>
-      <w:proofErr w:type="spellStart"/>
-      <w:r>
-        <w:rPr>
-          <w:lang w:val="en-US"/>
-        </w:rPr>
-        <w:t>WiFi</w:t>
-      </w:r>
-      <w:proofErr w:type="spellEnd"/>
-      <w:r>
+      <w:pPr>
+        <w:pStyle w:val="a7"/>
+        <w:ind w:left="426"/>
+        <w:rPr>
+          <w:sz w:val="28"/>
+          <w:szCs w:val="28"/>
+        </w:rPr>
+      </w:pPr>
+    </w:p>
+    <w:p>
+      <w:pPr>
+        <w:pStyle w:val="a7"/>
+        <w:numPr>
+          <w:ilvl w:val="0"/>
+          <w:numId w:val="1"/>
+        </w:numPr>
+        <w:ind w:left="426"/>
+        <w:rPr>
+          <w:sz w:val="28"/>
+          <w:szCs w:val="28"/>
+        </w:rPr>
+      </w:pPr>
+      <w:r>
+        <w:rPr>
+          <w:sz w:val="28"/>
+          <w:szCs w:val="28"/>
+        </w:rPr>
+        <w:t xml:space="preserve">Выбери свой </w:t>
+      </w:r>
+      <w:r>
+        <w:rPr>
+          <w:sz w:val="28"/>
+          <w:szCs w:val="28"/>
+          <w:lang w:val="en-US"/>
+        </w:rPr>
+        <w:t>Wi</w:t>
+      </w:r>
+      <w:r>
+        <w:rPr>
+          <w:sz w:val="28"/>
+          <w:szCs w:val="28"/>
+        </w:rPr>
+        <w:t>-</w:t>
+      </w:r>
+      <w:r>
+        <w:rPr>
+          <w:sz w:val="28"/>
+          <w:szCs w:val="28"/>
+          <w:lang w:val="en-US"/>
+        </w:rPr>
+        <w:t>Fi</w:t>
+      </w:r>
+      <w:r>
+        <w:rPr>
+          <w:sz w:val="28"/>
+          <w:szCs w:val="28"/>
+        </w:rPr>
         <w:t xml:space="preserve"> </w:t>
       </w:r>
       <w:r>
-        <w:t xml:space="preserve">точка доступа пропадет, а светильник будет доступен по </w:t>
-      </w:r>
-      <w:proofErr w:type="spellStart"/>
-      <w:r>
-        <w:rPr>
-          <w:lang w:val="en-US"/>
-        </w:rPr>
-        <w:t>ip</w:t>
-      </w:r>
-      <w:proofErr w:type="spellEnd"/>
-      <w:r>
-        <w:t xml:space="preserve"> </w:t>
-      </w:r>
-      <w:r>
-        <w:t>адресу, который выдаст ему роутер. Найти светильник можно несколькими способами.</w:t>
-      </w:r>
-    </w:p>
-    <w:p>
-      <w:r>
-        <w:t>а)</w:t>
-      </w:r>
-      <w:r>
-        <w:t xml:space="preserve"> (Простой)</w:t>
-      </w:r>
-      <w:r>
-        <w:t xml:space="preserve"> Скачать мобильное приложение </w:t>
-      </w:r>
-      <w:r>
-        <w:rPr>
-          <w:lang w:val="en-US"/>
-        </w:rPr>
-        <w:t>WLED</w:t>
-      </w:r>
-      <w:r>
-        <w:t xml:space="preserve"> </w:t>
-      </w:r>
-      <w:r>
-        <w:t xml:space="preserve">или </w:t>
-      </w:r>
-      <w:r>
-        <w:rPr>
-          <w:lang w:val="en-US"/>
-        </w:rPr>
-        <w:t>WLED</w:t>
-      </w:r>
-      <w:r>
-        <w:t xml:space="preserve"> </w:t>
-      </w:r>
-      <w:r>
-        <w:rPr>
-          <w:lang w:val="en-US"/>
-        </w:rPr>
-        <w:t>Native</w:t>
-      </w:r>
-      <w:r>
-        <w:t xml:space="preserve">. Мобильные приложения умеют автоматически находить </w:t>
-      </w:r>
-      <w:r>
-        <w:t>светильники,</w:t>
-      </w:r>
-      <w:r>
-        <w:t xml:space="preserve"> подключенные к одной </w:t>
-      </w:r>
-      <w:proofErr w:type="spellStart"/>
-      <w:r>
-        <w:rPr>
-          <w:lang w:val="en-US"/>
-        </w:rPr>
-        <w:t>WiFi</w:t>
-      </w:r>
-      <w:proofErr w:type="spellEnd"/>
-      <w:r>
-        <w:t xml:space="preserve"> </w:t>
-      </w:r>
-      <w:r>
-        <w:t>сети.</w:t>
-      </w:r>
-    </w:p>
-    <w:p>
-      <w:r>
-        <w:rPr>
-          <w:lang w:val="en-US"/>
-        </w:rPr>
-        <w:lastRenderedPageBreak/>
-        <w:t>b</w:t>
-      </w:r>
-      <w:r>
-        <w:t xml:space="preserve">) </w:t>
-      </w:r>
-      <w:r>
-        <w:t xml:space="preserve">(Продвинутый) </w:t>
-      </w:r>
-      <w:r>
-        <w:t xml:space="preserve">Зайти в управление вашего роутера, найти выданный </w:t>
-      </w:r>
-      <w:proofErr w:type="spellStart"/>
-      <w:r>
-        <w:rPr>
-          <w:lang w:val="en-US"/>
-        </w:rPr>
-        <w:t>ip</w:t>
-      </w:r>
-      <w:proofErr w:type="spellEnd"/>
-      <w:r>
-        <w:t xml:space="preserve"> </w:t>
-      </w:r>
-      <w:r>
-        <w:t xml:space="preserve">адрес и перейти по нему. </w:t>
-      </w:r>
-    </w:p>
-    <w:p>
-      <w:pPr>
+        <w:rPr>
+          <w:sz w:val="28"/>
+          <w:szCs w:val="28"/>
+        </w:rPr>
+        <w:t xml:space="preserve">нажав </w:t>
+      </w:r>
+      <w:r>
+        <w:rPr>
+          <w:sz w:val="28"/>
+          <w:szCs w:val="28"/>
+          <w:lang w:val="en-US"/>
+        </w:rPr>
+        <w:t>Scan</w:t>
+      </w:r>
+      <w:r>
+        <w:rPr>
+          <w:sz w:val="28"/>
+          <w:szCs w:val="28"/>
+        </w:rPr>
+        <w:t>.</w:t>
+      </w:r>
+    </w:p>
+    <w:p>
+      <w:pPr>
+        <w:pStyle w:val="a7"/>
+        <w:ind w:left="426"/>
+        <w:rPr>
+          <w:sz w:val="28"/>
+          <w:szCs w:val="28"/>
+        </w:rPr>
+      </w:pPr>
+      <w:r>
         <w:rPr>
           <w:i/>
           <w:iCs/>
         </w:rPr>
-      </w:pPr>
+        <w:t xml:space="preserve">Обрати внимание, поддерживается только 2.4ГГц </w:t>
+      </w:r>
+      <w:proofErr w:type="spellStart"/>
       <w:r>
         <w:rPr>
           <w:i/>
           <w:iCs/>
-        </w:rPr>
-        <w:t xml:space="preserve">По </w:t>
-      </w:r>
-      <w:proofErr w:type="spellStart"/>
+          <w:lang w:val="en-US"/>
+        </w:rPr>
+        <w:t>WiFi</w:t>
+      </w:r>
+      <w:proofErr w:type="spellEnd"/>
       <w:r>
         <w:rPr>
           <w:i/>
           <w:iCs/>
-          <w:lang w:val="en-US"/>
-        </w:rPr>
-        <w:t>ip</w:t>
-      </w:r>
-      <w:proofErr w:type="spellEnd"/>
-      <w:r>
-        <w:rPr>
-          <w:i/>
-          <w:iCs/>
-        </w:rPr>
-        <w:t xml:space="preserve"> адресу устройства так же доступны и с ПК или любого другого устройства с браузером. Обратите внимание, что устройство недоступно из другой сети (</w:t>
-      </w:r>
-      <w:r>
-        <w:rPr>
-          <w:i/>
-          <w:iCs/>
-        </w:rPr>
-        <w:t>например,</w:t>
-      </w:r>
-      <w:r>
-        <w:rPr>
-          <w:i/>
-          <w:iCs/>
-        </w:rPr>
-        <w:t xml:space="preserve"> через мобильный интернет). </w:t>
-      </w:r>
-    </w:p>
-    <w:p>
-      <w:pPr>
-        <w:jc w:val="center"/>
-        <w:rPr>
-          <w:b/>
-          <w:bCs/>
-        </w:rPr>
-      </w:pPr>
-      <w:r>
-        <w:rPr>
-          <w:b/>
-          <w:bCs/>
-        </w:rPr>
-        <w:t>Управление светильником</w:t>
-      </w:r>
-    </w:p>
-    <w:p>
-      <w:r>
-        <w:t>На изображении ниже</w:t>
-      </w:r>
-      <w:r>
-        <w:t xml:space="preserve"> экран </w:t>
-      </w:r>
-      <w:r>
-        <w:rPr>
-          <w:u w:val="single"/>
-          <w:lang w:val="en-US"/>
-        </w:rPr>
-        <w:t>Colors</w:t>
-      </w:r>
-      <w:r>
-        <w:t>. На нем можно выбрать цвета и палитры цветов (если они доступны для эффекта)</w:t>
-      </w:r>
-    </w:p>
-    <w:p>
-      <w:pPr>
-        <w:spacing w:after="0"/>
-      </w:pPr>
-      <w:r>
-        <w:rPr>
-          <w:lang w:val="en-US"/>
-        </w:rPr>
-        <w:t>Power</w:t>
-      </w:r>
-      <w:r>
-        <w:t xml:space="preserve"> – </w:t>
-      </w:r>
-      <w:r>
-        <w:t>Включение \ выключение</w:t>
-      </w:r>
-    </w:p>
-    <w:p>
-      <w:pPr>
-        <w:spacing w:after="0"/>
-      </w:pPr>
-      <w:r>
-        <w:rPr>
-          <w:lang w:val="en-US"/>
-        </w:rPr>
-        <w:t>Timer</w:t>
-      </w:r>
-      <w:r>
-        <w:t xml:space="preserve"> – </w:t>
-      </w:r>
-      <w:r>
-        <w:t>Таймер сна</w:t>
-      </w:r>
-    </w:p>
-    <w:p>
-      <w:pPr>
-        <w:spacing w:after="0"/>
-      </w:pPr>
-      <w:r>
-        <w:rPr>
-          <w:lang w:val="en-US"/>
-        </w:rPr>
-        <w:t>Sync</w:t>
-      </w:r>
-      <w:r>
-        <w:t xml:space="preserve"> </w:t>
-      </w:r>
-      <w:r>
-        <w:t>–</w:t>
-      </w:r>
-      <w:r>
-        <w:t xml:space="preserve"> </w:t>
-      </w:r>
-      <w:r>
-        <w:t>Синхронизация нескольких светильников</w:t>
-      </w:r>
-    </w:p>
-    <w:p>
-      <w:pPr>
-        <w:spacing w:after="0"/>
-      </w:pPr>
-      <w:r>
-        <w:rPr>
-          <w:lang w:val="en-US"/>
-        </w:rPr>
-        <w:t>Peek</w:t>
-      </w:r>
-      <w:r>
-        <w:t xml:space="preserve"> – </w:t>
-      </w:r>
-      <w:r>
-        <w:t>Превью текущего эффекта (полоска сверху)</w:t>
-      </w:r>
-    </w:p>
-    <w:p>
-      <w:pPr>
-        <w:spacing w:after="0"/>
-      </w:pPr>
-      <w:r>
-        <w:rPr>
-          <w:lang w:val="en-US"/>
-        </w:rPr>
-        <w:t>Info</w:t>
-      </w:r>
-      <w:r>
-        <w:t xml:space="preserve"> – </w:t>
-      </w:r>
-      <w:r>
-        <w:t>информация об устройстве</w:t>
-      </w:r>
-    </w:p>
-    <w:p>
-      <w:pPr>
-        <w:spacing w:after="0"/>
-      </w:pPr>
-      <w:r>
-        <w:rPr>
-          <w:lang w:val="en-US"/>
-        </w:rPr>
-        <w:t>Config</w:t>
-      </w:r>
-      <w:r>
-        <w:t xml:space="preserve"> – </w:t>
-      </w:r>
-      <w:r>
-        <w:t>Настройки</w:t>
-      </w:r>
-    </w:p>
-    <w:p>
-      <w:pPr>
-        <w:spacing w:after="0"/>
-      </w:pPr>
-      <w:r>
-        <w:rPr>
-          <w:lang w:val="en-US"/>
-        </w:rPr>
-        <w:t xml:space="preserve">Brightness </w:t>
-      </w:r>
-      <w:r>
-        <w:rPr>
-          <w:lang w:val="en-US"/>
-        </w:rPr>
-        <w:t>–</w:t>
-      </w:r>
-      <w:r>
-        <w:rPr>
-          <w:lang w:val="en-US"/>
-        </w:rPr>
-        <w:t xml:space="preserve"> </w:t>
-      </w:r>
-      <w:r>
-        <w:t>яркость</w:t>
-      </w:r>
-    </w:p>
-    <w:p>
-      <w:pPr>
-        <w:spacing w:after="0"/>
-      </w:pPr>
-    </w:p>
-    <w:p>
+        </w:rPr>
+        <w:t>.</w:t>
+      </w:r>
       <w:r>
         <w:rPr>
           <w:noProof/>
         </w:rPr>
-        <w:lastRenderedPageBreak/>
         <w:drawing>
-          <wp:inline distT="0" distB="0" distL="0" distR="0" wp14:anchorId="1BB6A6AF" wp14:editId="78775D8C">
-            <wp:extent cx="4301156" cy="5859780"/>
-            <wp:effectExtent l="0" t="0" r="4445" b="7620"/>
-            <wp:docPr id="3" name="Рисунок 3"/>
+          <wp:inline distT="0" distB="0" distL="0" distR="0" wp14:anchorId="5D87C3B9" wp14:editId="3C6C73CA">
+            <wp:extent cx="3463806" cy="2300287"/>
+            <wp:effectExtent l="0" t="0" r="3810" b="5080"/>
+            <wp:docPr id="2" name="Рисунок 2"/>
             <wp:cNvGraphicFramePr>
               <a:graphicFrameLocks xmlns:a="http://schemas.openxmlformats.org/drawingml/2006/main" noChangeAspect="1"/>
             </wp:cNvGraphicFramePr>
@@ -925,23 +898,39 @@
               <a:graphicData uri="http://schemas.openxmlformats.org/drawingml/2006/picture">
                 <pic:pic xmlns:pic="http://schemas.openxmlformats.org/drawingml/2006/picture">
                   <pic:nvPicPr>
-                    <pic:cNvPr id="1" name=""/>
-                    <pic:cNvPicPr/>
+                    <pic:cNvPr id="0" name="Picture 3"/>
+                    <pic:cNvPicPr>
+                      <a:picLocks noChangeAspect="1" noChangeArrowheads="1"/>
+                    </pic:cNvPicPr>
                   </pic:nvPicPr>
-                  <pic:blipFill>
-                    <a:blip r:embed="rId8"/>
-                    <a:stretch>
-                      <a:fillRect/>
-                    </a:stretch>
+                  <pic:blipFill rotWithShape="1">
+                    <a:blip r:embed="rId10">
+                      <a:extLst>
+                        <a:ext uri="{28A0092B-C50C-407E-A947-70E740481C1C}">
+                          <a14:useLocalDpi xmlns:a14="http://schemas.microsoft.com/office/drawing/2010/main" val="0"/>
+                        </a:ext>
+                      </a:extLst>
+                    </a:blip>
+                    <a:srcRect l="34249" r="32528" b="50492"/>
+                    <a:stretch/>
                   </pic:blipFill>
-                  <pic:spPr>
+                  <pic:spPr bwMode="auto">
                     <a:xfrm>
                       <a:off x="0" y="0"/>
-                      <a:ext cx="4313457" cy="5876538"/>
+                      <a:ext cx="3480590" cy="2311433"/>
                     </a:xfrm>
                     <a:prstGeom prst="rect">
                       <a:avLst/>
                     </a:prstGeom>
+                    <a:noFill/>
+                    <a:ln>
+                      <a:noFill/>
+                    </a:ln>
+                    <a:extLst>
+                      <a:ext uri="{53640926-AAD7-44D8-BBD7-CCE9431645EC}">
+                        <a14:shadowObscured xmlns:a14="http://schemas.microsoft.com/office/drawing/2010/main"/>
+                      </a:ext>
+                    </a:extLst>
                   </pic:spPr>
                 </pic:pic>
               </a:graphicData>
@@ -949,33 +938,599 @@
           </wp:inline>
         </w:drawing>
       </w:r>
-      <w:r>
-        <w:br w:type="page"/>
-      </w:r>
-    </w:p>
-    <w:p>
-      <w:r>
+    </w:p>
+    <w:p>
+      <w:pPr>
+        <w:pStyle w:val="a7"/>
+        <w:ind w:left="426"/>
+        <w:rPr>
+          <w:sz w:val="28"/>
+          <w:szCs w:val="28"/>
+        </w:rPr>
+      </w:pPr>
+    </w:p>
+    <w:p>
+      <w:pPr>
+        <w:pStyle w:val="a7"/>
+        <w:numPr>
+          <w:ilvl w:val="0"/>
+          <w:numId w:val="1"/>
+        </w:numPr>
+        <w:ind w:left="426"/>
+        <w:rPr>
+          <w:sz w:val="28"/>
+          <w:szCs w:val="28"/>
+        </w:rPr>
+      </w:pPr>
+      <w:r>
+        <w:rPr>
+          <w:sz w:val="28"/>
+          <w:szCs w:val="28"/>
+        </w:rPr>
+        <w:t xml:space="preserve">После подключения к </w:t>
+      </w:r>
+      <w:proofErr w:type="spellStart"/>
+      <w:r>
+        <w:rPr>
+          <w:sz w:val="28"/>
+          <w:szCs w:val="28"/>
+          <w:lang w:val="en-US"/>
+        </w:rPr>
+        <w:t>WiFi</w:t>
+      </w:r>
+      <w:proofErr w:type="spellEnd"/>
+      <w:r>
+        <w:rPr>
+          <w:sz w:val="28"/>
+          <w:szCs w:val="28"/>
+        </w:rPr>
+        <w:t xml:space="preserve"> </w:t>
+      </w:r>
+      <w:r>
+        <w:rPr>
+          <w:sz w:val="28"/>
+          <w:szCs w:val="28"/>
+        </w:rPr>
+        <w:t xml:space="preserve">точка доступа пропадет, а светильник будет доступен по </w:t>
+      </w:r>
+      <w:proofErr w:type="spellStart"/>
+      <w:r>
+        <w:rPr>
+          <w:sz w:val="28"/>
+          <w:szCs w:val="28"/>
+          <w:lang w:val="en-US"/>
+        </w:rPr>
+        <w:t>ip</w:t>
+      </w:r>
+      <w:proofErr w:type="spellEnd"/>
+      <w:r>
+        <w:rPr>
+          <w:sz w:val="28"/>
+          <w:szCs w:val="28"/>
+        </w:rPr>
+        <w:t xml:space="preserve"> адресу, который выдаст ему роутер. Найти светильник можно несколькими способами.</w:t>
+      </w:r>
+      <w:r>
+        <w:rPr>
+          <w:sz w:val="28"/>
+          <w:szCs w:val="28"/>
+        </w:rPr>
+        <w:t xml:space="preserve"> Это звучит сложно, но ты справишься. Есть несколько вариантов как им управлять.</w:t>
+      </w:r>
+    </w:p>
+    <w:p>
+      <w:pPr>
+        <w:rPr>
+          <w:sz w:val="28"/>
+          <w:szCs w:val="28"/>
+        </w:rPr>
+      </w:pPr>
+      <w:r>
+        <w:rPr>
+          <w:sz w:val="28"/>
+          <w:szCs w:val="28"/>
+        </w:rPr>
         <w:lastRenderedPageBreak/>
-        <w:t xml:space="preserve">На экране </w:t>
-      </w:r>
-      <w:r>
-        <w:rPr>
+        <w:t>а)</w:t>
+      </w:r>
+      <w:r>
+        <w:rPr>
+          <w:sz w:val="28"/>
+          <w:szCs w:val="28"/>
+        </w:rPr>
+        <w:t xml:space="preserve"> (Простой)</w:t>
+      </w:r>
+      <w:r>
+        <w:rPr>
+          <w:sz w:val="28"/>
+          <w:szCs w:val="28"/>
+        </w:rPr>
+        <w:t xml:space="preserve"> Скачать мобильное приложение </w:t>
+      </w:r>
+      <w:r>
+        <w:rPr>
+          <w:sz w:val="28"/>
+          <w:szCs w:val="28"/>
+          <w:lang w:val="en-US"/>
+        </w:rPr>
+        <w:t>WLED</w:t>
+      </w:r>
+      <w:r>
+        <w:rPr>
+          <w:sz w:val="28"/>
+          <w:szCs w:val="28"/>
+        </w:rPr>
+        <w:t xml:space="preserve"> или </w:t>
+      </w:r>
+      <w:r>
+        <w:rPr>
+          <w:sz w:val="28"/>
+          <w:szCs w:val="28"/>
+          <w:lang w:val="en-US"/>
+        </w:rPr>
+        <w:t>WLED</w:t>
+      </w:r>
+      <w:r>
+        <w:rPr>
+          <w:sz w:val="28"/>
+          <w:szCs w:val="28"/>
+        </w:rPr>
+        <w:t xml:space="preserve"> </w:t>
+      </w:r>
+      <w:r>
+        <w:rPr>
+          <w:sz w:val="28"/>
+          <w:szCs w:val="28"/>
+          <w:lang w:val="en-US"/>
+        </w:rPr>
+        <w:t>Native</w:t>
+      </w:r>
+      <w:r>
+        <w:rPr>
+          <w:sz w:val="28"/>
+          <w:szCs w:val="28"/>
+        </w:rPr>
+        <w:t xml:space="preserve">. Мобильные приложения умеют автоматически находить </w:t>
+      </w:r>
+      <w:r>
+        <w:rPr>
+          <w:sz w:val="28"/>
+          <w:szCs w:val="28"/>
+        </w:rPr>
+        <w:t>светильники,</w:t>
+      </w:r>
+      <w:r>
+        <w:rPr>
+          <w:sz w:val="28"/>
+          <w:szCs w:val="28"/>
+        </w:rPr>
+        <w:t xml:space="preserve"> подключенные к одной </w:t>
+      </w:r>
+      <w:proofErr w:type="spellStart"/>
+      <w:r>
+        <w:rPr>
+          <w:sz w:val="28"/>
+          <w:szCs w:val="28"/>
+          <w:lang w:val="en-US"/>
+        </w:rPr>
+        <w:t>WiFi</w:t>
+      </w:r>
+      <w:proofErr w:type="spellEnd"/>
+      <w:r>
+        <w:rPr>
+          <w:sz w:val="28"/>
+          <w:szCs w:val="28"/>
+        </w:rPr>
+        <w:t xml:space="preserve"> сети.</w:t>
+      </w:r>
+    </w:p>
+    <w:p>
+      <w:pPr>
+        <w:rPr>
+          <w:sz w:val="28"/>
+          <w:szCs w:val="28"/>
+        </w:rPr>
+      </w:pPr>
+      <w:r>
+        <w:rPr>
+          <w:sz w:val="28"/>
+          <w:szCs w:val="28"/>
+          <w:lang w:val="en-US"/>
+        </w:rPr>
+        <w:t>b</w:t>
+      </w:r>
+      <w:r>
+        <w:rPr>
+          <w:sz w:val="28"/>
+          <w:szCs w:val="28"/>
+        </w:rPr>
+        <w:t xml:space="preserve">) </w:t>
+      </w:r>
+      <w:r>
+        <w:rPr>
+          <w:sz w:val="28"/>
+          <w:szCs w:val="28"/>
+        </w:rPr>
+        <w:t xml:space="preserve">(Продвинутый) </w:t>
+      </w:r>
+      <w:r>
+        <w:rPr>
+          <w:sz w:val="28"/>
+          <w:szCs w:val="28"/>
+        </w:rPr>
+        <w:t xml:space="preserve">Зайти в </w:t>
+      </w:r>
+      <w:proofErr w:type="spellStart"/>
+      <w:r>
+        <w:rPr>
+          <w:sz w:val="28"/>
+          <w:szCs w:val="28"/>
+        </w:rPr>
+        <w:t>админку</w:t>
+      </w:r>
+      <w:proofErr w:type="spellEnd"/>
+      <w:r>
+        <w:rPr>
+          <w:sz w:val="28"/>
+          <w:szCs w:val="28"/>
+        </w:rPr>
+        <w:t xml:space="preserve"> </w:t>
+      </w:r>
+      <w:r>
+        <w:rPr>
+          <w:sz w:val="28"/>
+          <w:szCs w:val="28"/>
+        </w:rPr>
+        <w:t>роутера, найти выданный</w:t>
+      </w:r>
+      <w:r>
+        <w:rPr>
+          <w:sz w:val="28"/>
+          <w:szCs w:val="28"/>
+        </w:rPr>
+        <w:t xml:space="preserve"> светильнику</w:t>
+      </w:r>
+      <w:r>
+        <w:rPr>
+          <w:sz w:val="28"/>
+          <w:szCs w:val="28"/>
+        </w:rPr>
+        <w:t xml:space="preserve"> </w:t>
+      </w:r>
+      <w:proofErr w:type="spellStart"/>
+      <w:r>
+        <w:rPr>
+          <w:sz w:val="28"/>
+          <w:szCs w:val="28"/>
+          <w:lang w:val="en-US"/>
+        </w:rPr>
+        <w:t>ip</w:t>
+      </w:r>
+      <w:proofErr w:type="spellEnd"/>
+      <w:r>
+        <w:rPr>
+          <w:sz w:val="28"/>
+          <w:szCs w:val="28"/>
+        </w:rPr>
+        <w:t xml:space="preserve"> адрес и перейти по нему. </w:t>
+      </w:r>
+    </w:p>
+    <w:p>
+      <w:pPr>
+        <w:rPr>
+          <w:i/>
+          <w:iCs/>
+          <w:sz w:val="28"/>
+          <w:szCs w:val="28"/>
+        </w:rPr>
+      </w:pPr>
+      <w:r>
+        <w:rPr>
+          <w:i/>
+          <w:iCs/>
+          <w:sz w:val="28"/>
+          <w:szCs w:val="28"/>
+        </w:rPr>
+        <w:t xml:space="preserve">По </w:t>
+      </w:r>
+      <w:proofErr w:type="spellStart"/>
+      <w:r>
+        <w:rPr>
+          <w:i/>
+          <w:iCs/>
+          <w:sz w:val="28"/>
+          <w:szCs w:val="28"/>
+          <w:lang w:val="en-US"/>
+        </w:rPr>
+        <w:t>ip</w:t>
+      </w:r>
+      <w:proofErr w:type="spellEnd"/>
+      <w:r>
+        <w:rPr>
+          <w:i/>
+          <w:iCs/>
+          <w:sz w:val="28"/>
+          <w:szCs w:val="28"/>
+        </w:rPr>
+        <w:t xml:space="preserve"> адресу устройства так же доступны и с ПК или любого другого устройства с браузером. Обратите внимание, что устройство недоступно из другой сети (</w:t>
+      </w:r>
+      <w:r>
+        <w:rPr>
+          <w:i/>
+          <w:iCs/>
+          <w:sz w:val="28"/>
+          <w:szCs w:val="28"/>
+        </w:rPr>
+        <w:t>например,</w:t>
+      </w:r>
+      <w:r>
+        <w:rPr>
+          <w:i/>
+          <w:iCs/>
+          <w:sz w:val="28"/>
+          <w:szCs w:val="28"/>
+        </w:rPr>
+        <w:t xml:space="preserve"> через мобильный интернет). </w:t>
+      </w:r>
+    </w:p>
+    <w:p>
+      <w:pPr>
+        <w:jc w:val="center"/>
+        <w:rPr>
+          <w:b/>
+          <w:bCs/>
+        </w:rPr>
+      </w:pPr>
+    </w:p>
+    <w:p>
+      <w:pPr>
+        <w:jc w:val="center"/>
+        <w:rPr>
+          <w:b/>
+          <w:bCs/>
+          <w:sz w:val="28"/>
+          <w:szCs w:val="28"/>
+        </w:rPr>
+      </w:pPr>
+      <w:r>
+        <w:rPr>
+          <w:b/>
+          <w:bCs/>
+          <w:sz w:val="28"/>
+          <w:szCs w:val="28"/>
+        </w:rPr>
+        <w:t>Управление светильником</w:t>
+      </w:r>
+    </w:p>
+    <w:p>
+      <w:pPr>
+        <w:rPr>
+          <w:sz w:val="28"/>
+          <w:szCs w:val="28"/>
+        </w:rPr>
+      </w:pPr>
+      <w:r>
+        <w:rPr>
+          <w:sz w:val="28"/>
+          <w:szCs w:val="28"/>
+        </w:rPr>
+        <w:t>На изображении ниже</w:t>
+      </w:r>
+      <w:r>
+        <w:rPr>
+          <w:sz w:val="28"/>
+          <w:szCs w:val="28"/>
+        </w:rPr>
+        <w:t xml:space="preserve"> экран </w:t>
+      </w:r>
+      <w:r>
+        <w:rPr>
+          <w:sz w:val="28"/>
+          <w:szCs w:val="28"/>
           <w:u w:val="single"/>
           <w:lang w:val="en-US"/>
         </w:rPr>
-        <w:t>Effects</w:t>
-      </w:r>
-      <w:r>
+        <w:t>Colors</w:t>
+      </w:r>
+      <w:r>
+        <w:rPr>
+          <w:sz w:val="28"/>
+          <w:szCs w:val="28"/>
+        </w:rPr>
+        <w:t>. На нем можно выбрать цвета и палитры цветов (если они доступны для эффекта)</w:t>
+      </w:r>
+    </w:p>
+    <w:p>
+      <w:pPr>
+        <w:spacing w:after="0"/>
+        <w:rPr>
+          <w:sz w:val="28"/>
+          <w:szCs w:val="28"/>
+        </w:rPr>
+      </w:pPr>
+      <w:r>
+        <w:rPr>
+          <w:sz w:val="28"/>
+          <w:szCs w:val="28"/>
+          <w:lang w:val="en-US"/>
+        </w:rPr>
+        <w:t>Power</w:t>
+      </w:r>
+      <w:r>
+        <w:rPr>
+          <w:sz w:val="28"/>
+          <w:szCs w:val="28"/>
+        </w:rPr>
+        <w:t xml:space="preserve"> – Включение \ выключение</w:t>
+      </w:r>
+    </w:p>
+    <w:p>
+      <w:pPr>
+        <w:spacing w:after="0"/>
+        <w:rPr>
+          <w:sz w:val="28"/>
+          <w:szCs w:val="28"/>
+        </w:rPr>
+      </w:pPr>
+      <w:r>
+        <w:rPr>
+          <w:sz w:val="28"/>
+          <w:szCs w:val="28"/>
+          <w:lang w:val="en-US"/>
+        </w:rPr>
+        <w:t>Timer</w:t>
+      </w:r>
+      <w:r>
+        <w:rPr>
+          <w:sz w:val="28"/>
+          <w:szCs w:val="28"/>
+        </w:rPr>
+        <w:t xml:space="preserve"> – Таймер сна</w:t>
+      </w:r>
+    </w:p>
+    <w:p>
+      <w:pPr>
+        <w:spacing w:after="0"/>
+        <w:rPr>
+          <w:sz w:val="28"/>
+          <w:szCs w:val="28"/>
+        </w:rPr>
+      </w:pPr>
+      <w:r>
+        <w:rPr>
+          <w:sz w:val="28"/>
+          <w:szCs w:val="28"/>
+          <w:lang w:val="en-US"/>
+        </w:rPr>
+        <w:t>Sync</w:t>
+      </w:r>
+      <w:r>
+        <w:rPr>
+          <w:sz w:val="28"/>
+          <w:szCs w:val="28"/>
+        </w:rPr>
+        <w:t xml:space="preserve"> – Синхронизация нескольких светильников</w:t>
+      </w:r>
+    </w:p>
+    <w:p>
+      <w:pPr>
+        <w:spacing w:after="0"/>
+        <w:rPr>
+          <w:sz w:val="28"/>
+          <w:szCs w:val="28"/>
+        </w:rPr>
+      </w:pPr>
+      <w:r>
+        <w:rPr>
+          <w:sz w:val="28"/>
+          <w:szCs w:val="28"/>
+          <w:lang w:val="en-US"/>
+        </w:rPr>
+        <w:t>Peek</w:t>
+      </w:r>
+      <w:r>
+        <w:rPr>
+          <w:sz w:val="28"/>
+          <w:szCs w:val="28"/>
+        </w:rPr>
+        <w:t xml:space="preserve"> – Превью текущего эффекта (полоска сверху)</w:t>
+      </w:r>
+    </w:p>
+    <w:p>
+      <w:pPr>
+        <w:spacing w:after="0"/>
+        <w:rPr>
+          <w:sz w:val="28"/>
+          <w:szCs w:val="28"/>
+        </w:rPr>
+      </w:pPr>
+      <w:r>
+        <w:rPr>
+          <w:sz w:val="28"/>
+          <w:szCs w:val="28"/>
+          <w:lang w:val="en-US"/>
+        </w:rPr>
+        <w:t>Info</w:t>
+      </w:r>
+      <w:r>
+        <w:rPr>
+          <w:sz w:val="28"/>
+          <w:szCs w:val="28"/>
+        </w:rPr>
+        <w:t xml:space="preserve"> – информация об устройстве</w:t>
+      </w:r>
+    </w:p>
+    <w:p>
+      <w:pPr>
+        <w:spacing w:after="0"/>
+        <w:rPr>
+          <w:sz w:val="28"/>
+          <w:szCs w:val="28"/>
+        </w:rPr>
+      </w:pPr>
+      <w:r>
+        <w:rPr>
+          <w:sz w:val="28"/>
+          <w:szCs w:val="28"/>
+          <w:lang w:val="en-US"/>
+        </w:rPr>
+        <w:t>Config</w:t>
+      </w:r>
+      <w:r>
+        <w:rPr>
+          <w:sz w:val="28"/>
+          <w:szCs w:val="28"/>
+        </w:rPr>
+        <w:t xml:space="preserve"> – Настройки</w:t>
+      </w:r>
+    </w:p>
+    <w:p>
+      <w:pPr>
+        <w:spacing w:after="0"/>
+        <w:rPr>
+          <w:sz w:val="28"/>
+          <w:szCs w:val="28"/>
+        </w:rPr>
+      </w:pPr>
+      <w:r>
+        <w:rPr>
+          <w:sz w:val="28"/>
+          <w:szCs w:val="28"/>
+          <w:lang w:val="en-US"/>
+        </w:rPr>
+        <w:t xml:space="preserve">Brightness </w:t>
+      </w:r>
+      <w:r>
+        <w:rPr>
+          <w:sz w:val="28"/>
+          <w:szCs w:val="28"/>
+          <w:lang w:val="en-US"/>
+        </w:rPr>
+        <w:t>–</w:t>
+      </w:r>
+      <w:r>
+        <w:rPr>
+          <w:sz w:val="28"/>
+          <w:szCs w:val="28"/>
+          <w:lang w:val="en-US"/>
+        </w:rPr>
         <w:t xml:space="preserve"> </w:t>
       </w:r>
       <w:r>
-        <w:t>можно выбрать анимацию светильника. Большинство анимаций поддерживают палитры цветов.</w:t>
-      </w:r>
-    </w:p>
-    <w:p>
-      <w:pPr>
-        <w:rPr>
-          <w:lang w:val="en-US"/>
+        <w:rPr>
+          <w:sz w:val="28"/>
+          <w:szCs w:val="28"/>
+        </w:rPr>
+        <w:t>яркость</w:t>
+      </w:r>
+    </w:p>
+    <w:p>
+      <w:pPr>
+        <w:spacing w:after="0"/>
+        <w:jc w:val="center"/>
+        <w:rPr>
+          <w:sz w:val="28"/>
+          <w:szCs w:val="28"/>
         </w:rPr>
       </w:pPr>
       <w:r>
@@ -983,10 +1538,10 @@
           <w:noProof/>
         </w:rPr>
         <w:drawing>
-          <wp:inline distT="0" distB="0" distL="0" distR="0" wp14:anchorId="6AB6CE9A" wp14:editId="01CBCDA7">
-            <wp:extent cx="5483469" cy="7452360"/>
-            <wp:effectExtent l="0" t="0" r="3175" b="0"/>
-            <wp:docPr id="4" name="Рисунок 4"/>
+          <wp:inline distT="0" distB="0" distL="0" distR="0" wp14:anchorId="38CAF938" wp14:editId="79BD4B3A">
+            <wp:extent cx="2221707" cy="3839248"/>
+            <wp:effectExtent l="0" t="0" r="7620" b="0"/>
+            <wp:docPr id="11" name="Рисунок 11"/>
             <wp:cNvGraphicFramePr>
               <a:graphicFrameLocks xmlns:a="http://schemas.openxmlformats.org/drawingml/2006/main" noChangeAspect="1"/>
             </wp:cNvGraphicFramePr>
@@ -994,23 +1549,39 @@
               <a:graphicData uri="http://schemas.openxmlformats.org/drawingml/2006/picture">
                 <pic:pic xmlns:pic="http://schemas.openxmlformats.org/drawingml/2006/picture">
                   <pic:nvPicPr>
-                    <pic:cNvPr id="1" name=""/>
-                    <pic:cNvPicPr/>
+                    <pic:cNvPr id="0" name="Picture 5"/>
+                    <pic:cNvPicPr>
+                      <a:picLocks noChangeAspect="1" noChangeArrowheads="1"/>
+                    </pic:cNvPicPr>
                   </pic:nvPicPr>
-                  <pic:blipFill>
-                    <a:blip r:embed="rId9"/>
-                    <a:stretch>
-                      <a:fillRect/>
-                    </a:stretch>
+                  <pic:blipFill rotWithShape="1">
+                    <a:blip r:embed="rId11" cstate="print">
+                      <a:extLst>
+                        <a:ext uri="{28A0092B-C50C-407E-A947-70E740481C1C}">
+                          <a14:useLocalDpi xmlns:a14="http://schemas.microsoft.com/office/drawing/2010/main" val="0"/>
+                        </a:ext>
+                      </a:extLst>
+                    </a:blip>
+                    <a:srcRect t="11737" b="8502"/>
+                    <a:stretch/>
                   </pic:blipFill>
-                  <pic:spPr>
+                  <pic:spPr bwMode="auto">
                     <a:xfrm>
                       <a:off x="0" y="0"/>
-                      <a:ext cx="5495725" cy="7469016"/>
+                      <a:ext cx="2234701" cy="3861702"/>
                     </a:xfrm>
                     <a:prstGeom prst="rect">
                       <a:avLst/>
                     </a:prstGeom>
+                    <a:noFill/>
+                    <a:ln>
+                      <a:noFill/>
+                    </a:ln>
+                    <a:extLst>
+                      <a:ext uri="{53640926-AAD7-44D8-BBD7-CCE9431645EC}">
+                        <a14:shadowObscured xmlns:a14="http://schemas.microsoft.com/office/drawing/2010/main"/>
+                      </a:ext>
+                    </a:extLst>
                   </pic:spPr>
                 </pic:pic>
               </a:graphicData>
@@ -1020,38 +1591,151 @@
       </w:r>
     </w:p>
     <w:p>
-      <w:r>
-        <w:br w:type="page"/>
-      </w:r>
-    </w:p>
-    <w:p>
-      <w:r>
+      <w:pPr>
+        <w:rPr>
+          <w:sz w:val="28"/>
+          <w:szCs w:val="28"/>
+        </w:rPr>
+      </w:pPr>
+      <w:r>
+        <w:rPr>
+          <w:sz w:val="28"/>
+          <w:szCs w:val="28"/>
+        </w:rPr>
         <w:lastRenderedPageBreak/>
         <w:t xml:space="preserve">На экране </w:t>
       </w:r>
       <w:r>
         <w:rPr>
+          <w:sz w:val="28"/>
+          <w:szCs w:val="28"/>
           <w:u w:val="single"/>
           <w:lang w:val="en-US"/>
         </w:rPr>
+        <w:t>Effects</w:t>
+      </w:r>
+      <w:r>
+        <w:rPr>
+          <w:sz w:val="28"/>
+          <w:szCs w:val="28"/>
+        </w:rPr>
+        <w:t xml:space="preserve"> можно выбрать анимацию светильника. Большинство анимаций поддерживают палитры цветов.</w:t>
+      </w:r>
+    </w:p>
+    <w:p>
+      <w:pPr>
+        <w:jc w:val="center"/>
+        <w:rPr>
+          <w:sz w:val="28"/>
+          <w:szCs w:val="28"/>
+        </w:rPr>
+      </w:pPr>
+      <w:r>
+        <w:rPr>
+          <w:noProof/>
+        </w:rPr>
+        <w:drawing>
+          <wp:inline distT="0" distB="0" distL="0" distR="0" wp14:anchorId="13C3D27B" wp14:editId="17CEF5ED">
+            <wp:extent cx="2506905" cy="4336256"/>
+            <wp:effectExtent l="0" t="0" r="8255" b="7620"/>
+            <wp:docPr id="12" name="Рисунок 12"/>
+            <wp:cNvGraphicFramePr>
+              <a:graphicFrameLocks xmlns:a="http://schemas.openxmlformats.org/drawingml/2006/main" noChangeAspect="1"/>
+            </wp:cNvGraphicFramePr>
+            <a:graphic xmlns:a="http://schemas.openxmlformats.org/drawingml/2006/main">
+              <a:graphicData uri="http://schemas.openxmlformats.org/drawingml/2006/picture">
+                <pic:pic xmlns:pic="http://schemas.openxmlformats.org/drawingml/2006/picture">
+                  <pic:nvPicPr>
+                    <pic:cNvPr id="0" name="Picture 7"/>
+                    <pic:cNvPicPr>
+                      <a:picLocks noChangeAspect="1" noChangeArrowheads="1"/>
+                    </pic:cNvPicPr>
+                  </pic:nvPicPr>
+                  <pic:blipFill rotWithShape="1">
+                    <a:blip r:embed="rId12" cstate="print">
+                      <a:extLst>
+                        <a:ext uri="{28A0092B-C50C-407E-A947-70E740481C1C}">
+                          <a14:useLocalDpi xmlns:a14="http://schemas.microsoft.com/office/drawing/2010/main" val="0"/>
+                        </a:ext>
+                      </a:extLst>
+                    </a:blip>
+                    <a:srcRect t="11814" b="8348"/>
+                    <a:stretch/>
+                  </pic:blipFill>
+                  <pic:spPr bwMode="auto">
+                    <a:xfrm>
+                      <a:off x="0" y="0"/>
+                      <a:ext cx="2514186" cy="4348849"/>
+                    </a:xfrm>
+                    <a:prstGeom prst="rect">
+                      <a:avLst/>
+                    </a:prstGeom>
+                    <a:noFill/>
+                    <a:ln>
+                      <a:noFill/>
+                    </a:ln>
+                    <a:extLst>
+                      <a:ext uri="{53640926-AAD7-44D8-BBD7-CCE9431645EC}">
+                        <a14:shadowObscured xmlns:a14="http://schemas.microsoft.com/office/drawing/2010/main"/>
+                      </a:ext>
+                    </a:extLst>
+                  </pic:spPr>
+                </pic:pic>
+              </a:graphicData>
+            </a:graphic>
+          </wp:inline>
+        </w:drawing>
+      </w:r>
+    </w:p>
+    <w:p>
+      <w:pPr>
+        <w:rPr>
+          <w:sz w:val="28"/>
+          <w:szCs w:val="28"/>
+        </w:rPr>
+      </w:pPr>
+      <w:r>
+        <w:rPr>
+          <w:sz w:val="28"/>
+          <w:szCs w:val="28"/>
+        </w:rPr>
+        <w:t xml:space="preserve">На экране </w:t>
+      </w:r>
+      <w:r>
+        <w:rPr>
+          <w:sz w:val="28"/>
+          <w:szCs w:val="28"/>
+          <w:u w:val="single"/>
+          <w:lang w:val="en-US"/>
+        </w:rPr>
         <w:t>Presets</w:t>
       </w:r>
       <w:r>
-        <w:t xml:space="preserve"> </w:t>
-      </w:r>
-      <w:r>
-        <w:t>можно сохранить текущий набор настроек и быстро загружать его при необходимости</w:t>
-      </w:r>
-    </w:p>
-    <w:p>
+        <w:rPr>
+          <w:sz w:val="28"/>
+          <w:szCs w:val="28"/>
+        </w:rPr>
+        <w:t xml:space="preserve"> можно сохранить текущий набор настроек и быстро загружать его при необходимости</w:t>
+      </w:r>
+    </w:p>
+    <w:p>
+      <w:pPr>
+        <w:jc w:val="center"/>
+        <w:rPr>
+          <w:sz w:val="28"/>
+          <w:szCs w:val="28"/>
+        </w:rPr>
+      </w:pPr>
       <w:r>
         <w:rPr>
           <w:noProof/>
+          <w:sz w:val="28"/>
+          <w:szCs w:val="28"/>
         </w:rPr>
         <w:drawing>
-          <wp:inline distT="0" distB="0" distL="0" distR="0" wp14:anchorId="41A2D355" wp14:editId="6E66E8DC">
-            <wp:extent cx="5634004" cy="7612380"/>
-            <wp:effectExtent l="0" t="0" r="5080" b="7620"/>
+          <wp:inline distT="0" distB="0" distL="0" distR="0" wp14:anchorId="41A2D355" wp14:editId="1757A5E5">
+            <wp:extent cx="2564606" cy="2370673"/>
+            <wp:effectExtent l="0" t="0" r="7620" b="0"/>
             <wp:docPr id="7" name="Рисунок 7"/>
             <wp:cNvGraphicFramePr>
               <a:graphicFrameLocks xmlns:a="http://schemas.openxmlformats.org/drawingml/2006/main" noChangeAspect="1"/>
@@ -1063,20 +1747,27 @@
                     <pic:cNvPr id="1" name=""/>
                     <pic:cNvPicPr/>
                   </pic:nvPicPr>
-                  <pic:blipFill>
-                    <a:blip r:embed="rId10"/>
-                    <a:stretch>
-                      <a:fillRect/>
-                    </a:stretch>
+                  <pic:blipFill rotWithShape="1">
+                    <a:blip r:embed="rId13"/>
+                    <a:srcRect l="17831" t="6410" r="17481" b="49334"/>
+                    <a:stretch/>
                   </pic:blipFill>
-                  <pic:spPr>
+                  <pic:spPr bwMode="auto">
                     <a:xfrm>
                       <a:off x="0" y="0"/>
-                      <a:ext cx="5636868" cy="7616250"/>
+                      <a:ext cx="2573777" cy="2379150"/>
                     </a:xfrm>
                     <a:prstGeom prst="rect">
                       <a:avLst/>
                     </a:prstGeom>
+                    <a:ln>
+                      <a:noFill/>
+                    </a:ln>
+                    <a:extLst>
+                      <a:ext uri="{53640926-AAD7-44D8-BBD7-CCE9431645EC}">
+                        <a14:shadowObscured xmlns:a14="http://schemas.microsoft.com/office/drawing/2010/main"/>
+                      </a:ext>
+                    </a:extLst>
                   </pic:spPr>
                 </pic:pic>
               </a:graphicData>
@@ -1086,77 +1777,122 @@
       </w:r>
     </w:p>
     <w:p>
-      <w:r>
+      <w:pPr>
+        <w:rPr>
+          <w:sz w:val="28"/>
+          <w:szCs w:val="28"/>
+        </w:rPr>
+      </w:pPr>
+      <w:r>
+        <w:rPr>
+          <w:sz w:val="28"/>
+          <w:szCs w:val="28"/>
+        </w:rPr>
         <w:br w:type="page"/>
       </w:r>
     </w:p>
     <w:p>
-      <w:r>
+      <w:pPr>
+        <w:rPr>
+          <w:sz w:val="28"/>
+          <w:szCs w:val="28"/>
+        </w:rPr>
+      </w:pPr>
+      <w:r>
+        <w:rPr>
+          <w:sz w:val="28"/>
+          <w:szCs w:val="28"/>
+        </w:rPr>
         <w:lastRenderedPageBreak/>
         <w:t>В настройках (</w:t>
       </w:r>
       <w:r>
         <w:rPr>
+          <w:sz w:val="28"/>
+          <w:szCs w:val="28"/>
           <w:lang w:val="en-US"/>
         </w:rPr>
         <w:t>settings</w:t>
       </w:r>
       <w:r>
-        <w:t xml:space="preserve">) </w:t>
-      </w:r>
-      <w:r>
-        <w:t xml:space="preserve">в разделе </w:t>
-      </w:r>
-      <w:r>
-        <w:rPr>
+        <w:rPr>
+          <w:sz w:val="28"/>
+          <w:szCs w:val="28"/>
+        </w:rPr>
+        <w:t xml:space="preserve">) в разделе </w:t>
+      </w:r>
+      <w:r>
+        <w:rPr>
+          <w:sz w:val="28"/>
+          <w:szCs w:val="28"/>
           <w:lang w:val="en-US"/>
         </w:rPr>
         <w:t>LED</w:t>
       </w:r>
       <w:r>
+        <w:rPr>
+          <w:sz w:val="28"/>
+          <w:szCs w:val="28"/>
+        </w:rPr>
         <w:t xml:space="preserve"> </w:t>
       </w:r>
       <w:r>
         <w:rPr>
+          <w:sz w:val="28"/>
+          <w:szCs w:val="28"/>
           <w:lang w:val="en-US"/>
         </w:rPr>
         <w:t>settings</w:t>
       </w:r>
       <w:r>
-        <w:t xml:space="preserve"> </w:t>
-      </w:r>
-      <w:r>
-        <w:t xml:space="preserve">можно установить яркость при первом включении (после отключения от электросети) а также </w:t>
-      </w:r>
-      <w:r>
-        <w:rPr>
+        <w:rPr>
+          <w:sz w:val="28"/>
+          <w:szCs w:val="28"/>
+        </w:rPr>
+        <w:t xml:space="preserve"> можно установить яркость при первом включении (после отключения от электросети) а также </w:t>
+      </w:r>
+      <w:r>
+        <w:rPr>
+          <w:sz w:val="28"/>
+          <w:szCs w:val="28"/>
           <w:lang w:val="en-US"/>
         </w:rPr>
         <w:t>preset</w:t>
       </w:r>
       <w:r>
-        <w:t xml:space="preserve"> </w:t>
-      </w:r>
-      <w:r>
-        <w:t>который вы сохранили ранее</w:t>
-      </w:r>
-      <w:r>
-        <w:t xml:space="preserve">. </w:t>
-      </w:r>
-      <w:r>
-        <w:t xml:space="preserve">Там же можно найти </w:t>
-      </w:r>
-      <w:r>
+        <w:rPr>
+          <w:sz w:val="28"/>
+          <w:szCs w:val="28"/>
+        </w:rPr>
+        <w:t xml:space="preserve"> который вы сохранили ранее. Там же можно найти </w:t>
+      </w:r>
+      <w:r>
+        <w:rPr>
+          <w:sz w:val="28"/>
+          <w:szCs w:val="28"/>
+        </w:rPr>
         <w:t>много интересных настроек,</w:t>
       </w:r>
       <w:r>
+        <w:rPr>
+          <w:sz w:val="28"/>
+          <w:szCs w:val="28"/>
+        </w:rPr>
         <w:t xml:space="preserve"> связанных с цветом, переходами и т.п.</w:t>
       </w:r>
     </w:p>
     <w:p>
+      <w:pPr>
+        <w:rPr>
+          <w:sz w:val="28"/>
+          <w:szCs w:val="28"/>
+        </w:rPr>
+      </w:pPr>
       <w:r>
         <w:rPr>
           <w:noProof/>
+          <w:sz w:val="28"/>
+          <w:szCs w:val="28"/>
         </w:rPr>
         <w:drawing>
           <wp:inline distT="0" distB="0" distL="0" distR="0" wp14:anchorId="4494F590" wp14:editId="7F9D7074">
@@ -1174,7 +1910,7 @@
                     <pic:cNvPicPr/>
                   </pic:nvPicPr>
                   <pic:blipFill>
-                    <a:blip r:embed="rId11"/>
+                    <a:blip r:embed="rId14"/>
                     <a:stretch>
                       <a:fillRect/>
                     </a:stretch>
@@ -1195,6 +1931,10 @@
         </w:drawing>
       </w:r>
       <w:r>
+        <w:rPr>
+          <w:sz w:val="28"/>
+          <w:szCs w:val="28"/>
+        </w:rPr>
         <w:br w:type="page"/>
       </w:r>
     </w:p>
@@ -1204,76 +1944,120 @@
         <w:rPr>
           <w:b/>
           <w:bCs/>
+          <w:sz w:val="28"/>
+          <w:szCs w:val="28"/>
         </w:rPr>
       </w:pPr>
       <w:r>
         <w:rPr>
           <w:b/>
           <w:bCs/>
+          <w:sz w:val="28"/>
+          <w:szCs w:val="28"/>
         </w:rPr>
         <w:lastRenderedPageBreak/>
         <w:t>Полезная информация</w:t>
       </w:r>
     </w:p>
     <w:p>
-      <w:r>
+      <w:pPr>
+        <w:rPr>
+          <w:sz w:val="28"/>
+          <w:szCs w:val="28"/>
+        </w:rPr>
+      </w:pPr>
+      <w:r>
+        <w:rPr>
+          <w:sz w:val="28"/>
+          <w:szCs w:val="28"/>
+        </w:rPr>
         <w:t xml:space="preserve">Официальный сайт </w:t>
       </w:r>
       <w:r>
         <w:rPr>
+          <w:sz w:val="28"/>
+          <w:szCs w:val="28"/>
           <w:lang w:val="en-US"/>
         </w:rPr>
         <w:t>WLED</w:t>
       </w:r>
       <w:r>
+        <w:rPr>
+          <w:sz w:val="28"/>
+          <w:szCs w:val="28"/>
+        </w:rPr>
         <w:t xml:space="preserve">: </w:t>
       </w:r>
-      <w:hyperlink r:id="rId12" w:history="1">
+      <w:hyperlink r:id="rId15" w:history="1">
         <w:r>
           <w:rPr>
             <w:rStyle w:val="ac"/>
+            <w:sz w:val="28"/>
+            <w:szCs w:val="28"/>
           </w:rPr>
           <w:t>https://kno.wled.ge/</w:t>
         </w:r>
       </w:hyperlink>
       <w:r>
+        <w:rPr>
+          <w:sz w:val="28"/>
+          <w:szCs w:val="28"/>
+        </w:rPr>
         <w:t xml:space="preserve"> </w:t>
       </w:r>
     </w:p>
     <w:p>
       <w:pPr>
         <w:rPr>
-          <w:lang w:val="en-US"/>
-        </w:rPr>
-      </w:pPr>
-      <w:r>
+          <w:sz w:val="28"/>
+          <w:szCs w:val="28"/>
+          <w:lang w:val="en-US"/>
+        </w:rPr>
+      </w:pPr>
+      <w:r>
+        <w:rPr>
+          <w:sz w:val="28"/>
+          <w:szCs w:val="28"/>
+        </w:rPr>
         <w:t>П</w:t>
       </w:r>
       <w:r>
+        <w:rPr>
+          <w:sz w:val="28"/>
+          <w:szCs w:val="28"/>
+        </w:rPr>
         <w:t>рошивка</w:t>
       </w:r>
       <w:r>
         <w:rPr>
+          <w:sz w:val="28"/>
+          <w:szCs w:val="28"/>
           <w:lang w:val="en-US"/>
         </w:rPr>
         <w:t xml:space="preserve"> (WLED v16.0.0 battery)</w:t>
       </w:r>
       <w:r>
         <w:rPr>
+          <w:sz w:val="28"/>
+          <w:szCs w:val="28"/>
           <w:lang w:val="en-US"/>
         </w:rPr>
         <w:t>:</w:t>
       </w:r>
       <w:r>
         <w:rPr>
+          <w:sz w:val="28"/>
+          <w:szCs w:val="28"/>
           <w:lang w:val="en-US"/>
         </w:rPr>
         <w:t xml:space="preserve"> </w:t>
       </w:r>
-      <w:hyperlink r:id="rId13" w:history="1">
+      <w:hyperlink r:id="rId16" w:history="1">
         <w:r>
           <w:rPr>
             <w:rStyle w:val="ac"/>
+            <w:sz w:val="28"/>
+            <w:szCs w:val="28"/>
             <w:lang w:val="en-US"/>
           </w:rPr>
           <w:t>https://labs.polewka.ru/static/mc_lamp/firmware_esp8266_battery_16.0.0.bin</w:t>
@@ -1281,17 +2065,76 @@
       </w:hyperlink>
       <w:r>
         <w:rPr>
+          <w:sz w:val="28"/>
+          <w:szCs w:val="28"/>
           <w:lang w:val="en-US"/>
         </w:rPr>
         <w:t xml:space="preserve"> </w:t>
       </w:r>
     </w:p>
-    <w:p>
-      <w:pPr>
-        <w:rPr>
-          <w:lang w:val="en-US"/>
-        </w:rPr>
-      </w:pPr>
+    <w:p/>
+    <w:p/>
+    <w:p/>
+    <w:p/>
+    <w:p/>
+    <w:p/>
+    <w:p>
+      <w:pPr>
+        <w:jc w:val="center"/>
+      </w:pPr>
+      <w:r>
+        <w:rPr>
+          <w:noProof/>
+        </w:rPr>
+        <w:drawing>
+          <wp:inline distT="0" distB="0" distL="0" distR="0" wp14:anchorId="787A47B4" wp14:editId="221EEF4C">
+            <wp:extent cx="4736404" cy="4700588"/>
+            <wp:effectExtent l="0" t="0" r="7620" b="5080"/>
+            <wp:docPr id="13" name="Рисунок 13"/>
+            <wp:cNvGraphicFramePr>
+              <a:graphicFrameLocks xmlns:a="http://schemas.openxmlformats.org/drawingml/2006/main" noChangeAspect="1"/>
+            </wp:cNvGraphicFramePr>
+            <a:graphic xmlns:a="http://schemas.openxmlformats.org/drawingml/2006/main">
+              <a:graphicData uri="http://schemas.openxmlformats.org/drawingml/2006/picture">
+                <pic:pic xmlns:pic="http://schemas.openxmlformats.org/drawingml/2006/picture">
+                  <pic:nvPicPr>
+                    <pic:cNvPr id="0" name="Picture 9"/>
+                    <pic:cNvPicPr>
+                      <a:picLocks noChangeAspect="1" noChangeArrowheads="1"/>
+                    </pic:cNvPicPr>
+                  </pic:nvPicPr>
+                  <pic:blipFill>
+                    <a:blip r:embed="rId17" cstate="print">
+                      <a:extLst>
+                        <a:ext uri="{28A0092B-C50C-407E-A947-70E740481C1C}">
+                          <a14:useLocalDpi xmlns:a14="http://schemas.microsoft.com/office/drawing/2010/main" val="0"/>
+                        </a:ext>
+                      </a:extLst>
+                    </a:blip>
+                    <a:srcRect/>
+                    <a:stretch>
+                      <a:fillRect/>
+                    </a:stretch>
+                  </pic:blipFill>
+                  <pic:spPr bwMode="auto">
+                    <a:xfrm>
+                      <a:off x="0" y="0"/>
+                      <a:ext cx="4740399" cy="4704553"/>
+                    </a:xfrm>
+                    <a:prstGeom prst="rect">
+                      <a:avLst/>
+                    </a:prstGeom>
+                    <a:noFill/>
+                    <a:ln>
+                      <a:noFill/>
+                    </a:ln>
+                  </pic:spPr>
+                </pic:pic>
+              </a:graphicData>
+            </a:graphic>
+          </wp:inline>
+        </w:drawing>
+      </w:r>
     </w:p>
     <w:sectPr>
       <w:pgSz w:w="11906" w:h="16838"/>
@@ -1301,6 +2144,103 @@
     </w:sectPr>
   </w:body>
 </w:document>
+</file>
+
+<file path=word/numbering.xml><?xml version="1.0" encoding="utf-8"?>
+<w:numbering xmlns:wpc="http://schemas.microsoft.com/office/word/2010/wordprocessingCanvas" xmlns:cx="http://schemas.microsoft.com/office/drawing/2014/chartex" xmlns:cx1="http://schemas.microsoft.com/office/drawing/2015/9/8/chartex" xmlns:cx2="http://schemas.microsoft.com/office/drawing/2015/10/21/chartex" xmlns:cx3="http://schemas.microsoft.com/office/drawing/2016/5/9/chartex" xmlns:cx4="http://schemas.microsoft.com/office/drawing/2016/5/10/chartex" xmlns:cx5="http://schemas.microsoft.com/office/drawing/2016/5/11/chartex" xmlns:cx6="http://schemas.microsoft.com/office/drawing/2016/5/12/chartex" xmlns:cx7="http://schemas.microsoft.com/office/drawing/2016/5/13/chartex" xmlns:cx8="http://schemas.microsoft.com/office/drawing/2016/5/14/chartex" xmlns:mc="http://schemas.openxmlformats.org/markup-compatibility/2006" xmlns:aink="http://schemas.microsoft.com/office/drawing/2016/ink" xmlns:am3d="http://schemas.microsoft.com/office/drawing/2017/model3d" xmlns:o="urn:schemas-microsoft-com:office:office" xmlns:oel="http://schemas.microsoft.com/office/2019/extlst" xmlns:r="http://schemas.openxmlformats.org/officeDocument/2006/relationships" xmlns:m="http://schemas.openxmlformats.org/officeDocument/2006/math" xmlns:v="urn:schemas-microsoft-com:vml" xmlns:wp14="http://schemas.microsoft.com/office/word/2010/wordprocessingDrawing" xmlns:wp="http://schemas.openxmlformats.org/drawingml/2006/wordprocessingDrawing" xmlns:w10="urn:schemas-microsoft-com:office:word" xmlns:w="http://schemas.openxmlformats.org/wordprocessingml/2006/main" xmlns:w14="http://schemas.microsoft.com/office/word/2010/wordml" xmlns:w15="http://schemas.microsoft.com/office/word/2012/wordml" xmlns:w16cex="http://schemas.microsoft.com/office/word/2018/wordml/cex" xmlns:w16cid="http://schemas.microsoft.com/office/word/2016/wordml/cid" xmlns:w16="http://schemas.microsoft.com/office/word/2018/wordml" xmlns:w16sdtdh="http://schemas.microsoft.com/office/word/2020/wordml/sdtdatahash" xmlns:w16se="http://schemas.microsoft.com/office/word/2015/wordml/symex" xmlns:wpg="http://schemas.microsoft.com/office/word/2010/wordprocessingGroup" xmlns:wpi="http://schemas.microsoft.com/office/word/2010/wordprocessingInk" xmlns:wne="http://schemas.microsoft.com/office/word/2006/wordml" xmlns:wps="http://schemas.microsoft.com/office/word/2010/wordprocessingShape" mc:Ignorable="w14 w15 w16se w16cid w16 w16cex w16sdtdh wp14">
+  <w:abstractNum w:abstractNumId="0" w15:restartNumberingAfterBreak="0">
+    <w:nsid w:val="1F4F505B"/>
+    <w:multiLevelType w:val="hybridMultilevel"/>
+    <w:tmpl w:val="AFEA1EB6"/>
+    <w:lvl w:ilvl="0" w:tplc="0419000F">
+      <w:start w:val="1"/>
+      <w:numFmt w:val="decimal"/>
+      <w:lvlText w:val="%1."/>
+      <w:lvlJc w:val="left"/>
+      <w:pPr>
+        <w:ind w:left="720" w:hanging="360"/>
+      </w:pPr>
+      <w:rPr>
+        <w:rFonts w:hint="default"/>
+      </w:rPr>
+    </w:lvl>
+    <w:lvl w:ilvl="1" w:tplc="04190019" w:tentative="1">
+      <w:start w:val="1"/>
+      <w:numFmt w:val="lowerLetter"/>
+      <w:lvlText w:val="%2."/>
+      <w:lvlJc w:val="left"/>
+      <w:pPr>
+        <w:ind w:left="1440" w:hanging="360"/>
+      </w:pPr>
+    </w:lvl>
+    <w:lvl w:ilvl="2" w:tplc="0419001B" w:tentative="1">
+      <w:start w:val="1"/>
+      <w:numFmt w:val="lowerRoman"/>
+      <w:lvlText w:val="%3."/>
+      <w:lvlJc w:val="right"/>
+      <w:pPr>
+        <w:ind w:left="2160" w:hanging="180"/>
+      </w:pPr>
+    </w:lvl>
+    <w:lvl w:ilvl="3" w:tplc="0419000F" w:tentative="1">
+      <w:start w:val="1"/>
+      <w:numFmt w:val="decimal"/>
+      <w:lvlText w:val="%4."/>
+      <w:lvlJc w:val="left"/>
+      <w:pPr>
+        <w:ind w:left="2880" w:hanging="360"/>
+      </w:pPr>
+    </w:lvl>
+    <w:lvl w:ilvl="4" w:tplc="04190019" w:tentative="1">
+      <w:start w:val="1"/>
+      <w:numFmt w:val="lowerLetter"/>
+      <w:lvlText w:val="%5."/>
+      <w:lvlJc w:val="left"/>
+      <w:pPr>
+        <w:ind w:left="3600" w:hanging="360"/>
+      </w:pPr>
+    </w:lvl>
+    <w:lvl w:ilvl="5" w:tplc="0419001B" w:tentative="1">
+      <w:start w:val="1"/>
+      <w:numFmt w:val="lowerRoman"/>
+      <w:lvlText w:val="%6."/>
+      <w:lvlJc w:val="right"/>
+      <w:pPr>
+        <w:ind w:left="4320" w:hanging="180"/>
+      </w:pPr>
+    </w:lvl>
+    <w:lvl w:ilvl="6" w:tplc="0419000F" w:tentative="1">
+      <w:start w:val="1"/>
+      <w:numFmt w:val="decimal"/>
+      <w:lvlText w:val="%7."/>
+      <w:lvlJc w:val="left"/>
+      <w:pPr>
+        <w:ind w:left="5040" w:hanging="360"/>
+      </w:pPr>
+    </w:lvl>
+    <w:lvl w:ilvl="7" w:tplc="04190019" w:tentative="1">
+      <w:start w:val="1"/>
+      <w:numFmt w:val="lowerLetter"/>
+      <w:lvlText w:val="%8."/>
+      <w:lvlJc w:val="left"/>
+      <w:pPr>
+        <w:ind w:left="5760" w:hanging="360"/>
+      </w:pPr>
+    </w:lvl>
+    <w:lvl w:ilvl="8" w:tplc="0419001B" w:tentative="1">
+      <w:start w:val="1"/>
+      <w:numFmt w:val="lowerRoman"/>
+      <w:lvlText w:val="%9."/>
+      <w:lvlJc w:val="right"/>
+      <w:pPr>
+        <w:ind w:left="6480" w:hanging="180"/>
+      </w:pPr>
+    </w:lvl>
+  </w:abstractNum>
+  <w:num w:numId="1" w16cid:durableId="1756586682">
+    <w:abstractNumId w:val="0"/>
+  </w:num>
+</w:numbering>
 </file>
 
 <file path=word/styles.xml><?xml version="1.0" encoding="utf-8"?>

</xml_diff>